<commit_message>
chore: update educational contract template
Update the document template for educational contracts to reflect current requirements.
</commit_message>
<xml_diff>
--- a/public/template.docx
+++ b/public/template.docx
@@ -6,18 +6,32 @@
       <w:pPr>
         <w:jc w:val="center"/>
         <w:rPr>
+          <w:rFonts w:cs="2  Titr" w:hint="cs"/>
+          <w:b/>
+          <w:bCs/>
+          <w:rtl/>
+        </w:rPr>
+      </w:pPr>
+      <w:r>
+        <w:rPr>
           <w:rFonts w:cs="2  Titr"/>
-          <w:b/>
-          <w:bCs/>
-          <w:rtl/>
-        </w:rPr>
-      </w:pPr>
+          <w:rtl/>
+        </w:rPr>
+        <w:t xml:space="preserve">قرارداد همکاری فیمابین </w:t>
+      </w:r>
       <w:r>
         <w:rPr>
           <w:rFonts w:cs="2  Titr"/>
-          <w:rtl/>
-        </w:rPr>
-        <w:t xml:space="preserve">قرارداد همکاری فیمابین </w:t>
+        </w:rPr>
+        <w:t xml:space="preserve"> </w:t>
+      </w:r>
+      <w:r>
+        <w:rPr>
+          <w:rFonts w:ascii="2  Titr" w:hAnsi="2  Titr" w:cs="2  Titr"/>
+          <w:b/>
+          <w:bCs/>
+        </w:rPr>
+        <w:t>{mojri_name}</w:t>
       </w:r>
       <w:r>
         <w:rPr>
@@ -27,124 +41,102 @@
       </w:r>
       <w:r>
         <w:rPr>
+          <w:rFonts w:cs="2  Titr"/>
+          <w:rtl/>
+        </w:rPr>
+        <w:t xml:space="preserve">و اداره کل آموزش فنی و حرفه ای استان گلستان </w:t>
+      </w:r>
+      <w:r>
+        <w:rPr>
+          <w:rFonts w:ascii="Times New Roman" w:hAnsi="Times New Roman" w:cs="Times New Roman" w:hint="cs"/>
+          <w:rtl/>
+        </w:rPr>
+        <w:t>–</w:t>
+      </w:r>
+      <w:r>
+        <w:rPr>
+          <w:rFonts w:cs="2  Titr"/>
+          <w:rtl/>
+        </w:rPr>
+        <w:t xml:space="preserve"> </w:t>
+      </w:r>
+      <w:r>
+        <w:rPr>
+          <w:rFonts w:cs="2  Titr" w:hint="cs"/>
+          <w:rtl/>
+        </w:rPr>
+        <w:t>مرکز</w:t>
+      </w:r>
+      <w:r>
+        <w:rPr>
+          <w:rFonts w:cs="2  Titr"/>
+          <w:rtl/>
+        </w:rPr>
+        <w:t xml:space="preserve"> </w:t>
+      </w:r>
+      <w:r>
+        <w:rPr>
           <w:rFonts w:ascii="2  Titr" w:hAnsi="2  Titr" w:cs="2  Titr"/>
           <w:b/>
           <w:bCs/>
         </w:rPr>
-        <w:t>{</w:t>
-      </w:r>
-      <w:proofErr w:type="spellStart"/>
+        <w:t>{center_name}</w:t>
+      </w:r>
+      <w:r>
+        <w:rPr>
+          <w:rFonts w:cs="2  Titr" w:hint="cs"/>
+          <w:b/>
+          <w:bCs/>
+          <w:rtl/>
+        </w:rPr>
+        <w:t xml:space="preserve"> </w:t>
+      </w:r>
       <w:r>
         <w:rPr>
           <w:rFonts w:ascii="2  Titr" w:hAnsi="2  Titr" w:cs="2  Titr"/>
           <w:b/>
           <w:bCs/>
-        </w:rPr>
-        <w:t>mojri_name</w:t>
-      </w:r>
-      <w:proofErr w:type="spellEnd"/>
-      <w:r>
-        <w:rPr>
-          <w:rFonts w:ascii="2  Titr" w:hAnsi="2  Titr" w:cs="2  Titr"/>
-          <w:b/>
-          <w:bCs/>
-        </w:rPr>
-        <w:t>}</w:t>
-      </w:r>
-      <w:r>
-        <w:rPr>
-          <w:rFonts w:cs="2  Titr"/>
-        </w:rPr>
-        <w:t xml:space="preserve"> </w:t>
-      </w:r>
-      <w:r>
-        <w:rPr>
-          <w:rFonts w:cs="2  Titr"/>
-          <w:rtl/>
-        </w:rPr>
-        <w:t xml:space="preserve">و اداره کل آموزش فنی و حرفه ای استان گلستان </w:t>
-      </w:r>
-      <w:r>
-        <w:rPr>
-          <w:rFonts w:ascii="Times New Roman" w:hAnsi="Times New Roman" w:cs="Times New Roman" w:hint="cs"/>
-          <w:rtl/>
-        </w:rPr>
-        <w:t>–</w:t>
-      </w:r>
-      <w:r>
-        <w:rPr>
-          <w:rFonts w:cs="2  Titr"/>
-          <w:rtl/>
-        </w:rPr>
-        <w:t xml:space="preserve"> </w:t>
-      </w:r>
-      <w:r>
-        <w:rPr>
-          <w:rFonts w:cs="2  Titr" w:hint="cs"/>
-          <w:rtl/>
-        </w:rPr>
-        <w:t>مرکز</w:t>
-      </w:r>
-      <w:r>
-        <w:rPr>
-          <w:rFonts w:cs="2  Titr"/>
-          <w:rtl/>
-        </w:rPr>
-        <w:t xml:space="preserve"> </w:t>
-      </w:r>
-      <w:r>
-        <w:rPr>
-          <w:rFonts w:ascii="2  Titr" w:hAnsi="2  Titr" w:cs="2  Titr"/>
-          <w:b/>
-          <w:bCs/>
-        </w:rPr>
-        <w:t>{</w:t>
-      </w:r>
-      <w:proofErr w:type="spellStart"/>
-      <w:r>
-        <w:rPr>
-          <w:rFonts w:ascii="2  Titr" w:hAnsi="2  Titr" w:cs="2  Titr"/>
-          <w:b/>
-          <w:bCs/>
-        </w:rPr>
-        <w:t>center_name</w:t>
-      </w:r>
-      <w:proofErr w:type="spellEnd"/>
-      <w:r>
-        <w:rPr>
-          <w:rFonts w:ascii="2  Titr" w:hAnsi="2  Titr" w:cs="2  Titr"/>
-          <w:b/>
-          <w:bCs/>
-        </w:rPr>
-        <w:t>}</w:t>
+          <w:sz w:val="20"/>
+          <w:szCs w:val="20"/>
+        </w:rPr>
+        <w:t>{level}</w:t>
       </w:r>
     </w:p>
     <w:p>
       <w:pPr>
         <w:jc w:val="both"/>
         <w:rPr>
+          <w:rFonts w:cs="2  Titr" w:hint="cs"/>
+          <w:b/>
+          <w:bCs/>
+          <w:rtl/>
+        </w:rPr>
+      </w:pPr>
+      <w:r>
+        <w:rPr>
           <w:rFonts w:cs="2  Titr"/>
           <w:b/>
           <w:bCs/>
-        </w:rPr>
-      </w:pPr>
+          <w:rtl/>
+        </w:rPr>
+        <w:t>مقدمه</w:t>
+      </w:r>
+      <w:r>
+        <w:rPr>
+          <w:rFonts w:cs="2  Titr" w:hint="cs"/>
+          <w:b/>
+          <w:bCs/>
+          <w:rtl/>
+        </w:rPr>
+        <w:t xml:space="preserve">  </w:t>
+      </w:r>
       <w:r>
         <w:rPr>
           <w:rFonts w:cs="2  Titr"/>
           <w:b/>
           <w:bCs/>
-          <w:rtl/>
-        </w:rPr>
-        <w:t>مقدمه</w:t>
-      </w:r>
-      <w:r>
-        <w:rPr>
-          <w:rFonts w:cs="2  Titr" w:hint="cs"/>
-          <w:b/>
-          <w:bCs/>
-          <w:rtl/>
-        </w:rPr>
-        <w:t xml:space="preserve">  </w:t>
+        </w:rPr>
+        <w:t xml:space="preserve"> </w:t>
       </w:r>
       <w:r>
         <w:rPr>
@@ -152,15 +144,15 @@
           <w:b/>
           <w:bCs/>
         </w:rPr>
+        <w:t xml:space="preserve"> :</w:t>
+      </w:r>
+      <w:r>
+        <w:rPr>
+          <w:rFonts w:ascii="2  Titr" w:hAnsi="2  Titr" w:cs="2  Titr"/>
+          <w:b/>
+          <w:bCs/>
+        </w:rPr>
         <w:t xml:space="preserve"> </w:t>
-      </w:r>
-      <w:r>
-        <w:rPr>
-          <w:rFonts w:cs="2  Titr"/>
-          <w:b/>
-          <w:bCs/>
-        </w:rPr>
-        <w:t xml:space="preserve"> :</w:t>
       </w:r>
     </w:p>
     <w:p>
@@ -182,7 +174,18 @@
           <w:szCs w:val="20"/>
           <w:rtl/>
         </w:rPr>
-        <w:t xml:space="preserve">به استناد شیوه نامه اجرایی خدمات آموزشی و فرهنگی سازمان آموزش فنی و حرفه ای کشور و در راستای ارتقاء سطح شایستگی های حرفه ای متقاضیان این قرارداد آموزشی بین </w:t>
+        <w:t>به استناد شیوه نامه اجر</w:t>
+      </w:r>
+      <w:bookmarkStart w:id="0" w:name="_GoBack"/>
+      <w:bookmarkEnd w:id="0"/>
+      <w:r>
+        <w:rPr>
+          <w:rFonts w:cs="B Nazanin"/>
+          <w:sz w:val="20"/>
+          <w:szCs w:val="20"/>
+          <w:rtl/>
+        </w:rPr>
+        <w:t xml:space="preserve">ایی خدمات آموزشی و فرهنگی سازمان آموزش فنی و حرفه ای کشور و در راستای ارتقاء سطح شایستگی های حرفه ای متقاضیان این قرارداد آموزشی بین </w:t>
       </w:r>
       <w:r>
         <w:rPr>
@@ -191,9 +194,43 @@
           <w:bCs/>
           <w:szCs w:val="20"/>
         </w:rPr>
-        <w:t>{</w:t>
-      </w:r>
-      <w:proofErr w:type="spellStart"/>
+        <w:t>{mojri_name}</w:t>
+      </w:r>
+      <w:r>
+        <w:rPr>
+          <w:rFonts w:cs="B Nazanin"/>
+          <w:sz w:val="20"/>
+          <w:szCs w:val="20"/>
+        </w:rPr>
+        <w:t xml:space="preserve"> </w:t>
+      </w:r>
+      <w:r>
+        <w:rPr>
+          <w:rFonts w:cs="B Nazanin" w:hint="cs"/>
+          <w:sz w:val="20"/>
+          <w:szCs w:val="20"/>
+          <w:rtl/>
+        </w:rPr>
+        <w:t xml:space="preserve"> </w:t>
+      </w:r>
+      <w:r>
+        <w:rPr>
+          <w:rFonts w:cs="B Nazanin"/>
+          <w:sz w:val="20"/>
+          <w:szCs w:val="20"/>
+          <w:rtl/>
+        </w:rPr>
+        <w:t xml:space="preserve">به نمايندگي آقا / خانم </w:t>
+      </w:r>
+      <w:r>
+        <w:rPr>
+          <w:rFonts w:cs="B Nazanin"/>
+          <w:b/>
+          <w:bCs/>
+          <w:szCs w:val="20"/>
+        </w:rPr>
+        <w:t xml:space="preserve"> </w:t>
+      </w:r>
       <w:r>
         <w:rPr>
           <w:rFonts w:ascii="B Nazanin" w:hAnsi="B Nazanin" w:cs="B Nazanin"/>
@@ -201,9 +238,25 @@
           <w:bCs/>
           <w:szCs w:val="20"/>
         </w:rPr>
-        <w:t>mojri_name</w:t>
-      </w:r>
-      <w:proofErr w:type="spellEnd"/>
+        <w:t>{mojri_rep}</w:t>
+      </w:r>
+      <w:r>
+        <w:rPr>
+          <w:rFonts w:cs="B Nazanin"/>
+          <w:sz w:val="20"/>
+          <w:szCs w:val="20"/>
+        </w:rPr>
+        <w:t xml:space="preserve"> </w:t>
+      </w:r>
+      <w:r>
+        <w:rPr>
+          <w:rFonts w:cs="B Nazanin"/>
+          <w:sz w:val="20"/>
+          <w:szCs w:val="20"/>
+          <w:rtl/>
+        </w:rPr>
+        <w:t xml:space="preserve">بعنوان </w:t>
+      </w:r>
       <w:r>
         <w:rPr>
           <w:rFonts w:ascii="B Nazanin" w:hAnsi="B Nazanin" w:cs="B Nazanin"/>
@@ -211,7 +264,7 @@
           <w:bCs/>
           <w:szCs w:val="20"/>
         </w:rPr>
-        <w:t>}</w:t>
+        <w:t>{mojri_title}</w:t>
       </w:r>
       <w:r>
         <w:rPr>
@@ -223,10 +276,35 @@
       </w:r>
       <w:r>
         <w:rPr>
-          <w:rFonts w:cs="B Nazanin" w:hint="cs"/>
-          <w:sz w:val="20"/>
-          <w:szCs w:val="20"/>
-          <w:rtl/>
+          <w:rFonts w:cs="B Nazanin"/>
+          <w:sz w:val="20"/>
+          <w:szCs w:val="20"/>
+          <w:rtl/>
+        </w:rPr>
+        <w:t>به آدرس</w:t>
+      </w:r>
+      <w:r>
+        <w:rPr>
+          <w:rFonts w:cs="B Nazanin"/>
+          <w:sz w:val="20"/>
+          <w:szCs w:val="20"/>
+        </w:rPr>
+        <w:t xml:space="preserve"> : </w:t>
+      </w:r>
+      <w:r>
+        <w:rPr>
+          <w:rFonts w:ascii="B Nazanin" w:hAnsi="B Nazanin" w:cs="B Nazanin"/>
+          <w:b/>
+          <w:bCs/>
+          <w:szCs w:val="20"/>
+        </w:rPr>
+        <w:t>{mojri_address}</w:t>
+      </w:r>
+      <w:r>
+        <w:rPr>
+          <w:rFonts w:cs="B Nazanin"/>
+          <w:sz w:val="20"/>
+          <w:szCs w:val="20"/>
         </w:rPr>
         <w:t xml:space="preserve"> </w:t>
       </w:r>
@@ -237,27 +315,16 @@
           <w:szCs w:val="20"/>
           <w:rtl/>
         </w:rPr>
-        <w:t xml:space="preserve">به نمايندگي آقا / خانم </w:t>
-      </w:r>
-      <w:r>
-        <w:rPr>
-          <w:rFonts w:cs="B Nazanin"/>
-          <w:b/>
-          <w:bCs/>
-          <w:szCs w:val="20"/>
-        </w:rPr>
-        <w:t xml:space="preserve"> </w:t>
+        <w:t xml:space="preserve">به شماره </w:t>
       </w:r>
       <w:r>
         <w:rPr>
           <w:rFonts w:ascii="B Nazanin" w:hAnsi="B Nazanin" w:cs="B Nazanin"/>
-          <w:b/>
-          <w:bCs/>
-          <w:szCs w:val="20"/>
-        </w:rPr>
-        <w:t>{</w:t>
-      </w:r>
-      <w:proofErr w:type="spellStart"/>
+          <w:szCs w:val="20"/>
+          <w:rtl/>
+        </w:rPr>
+        <w:t>تماس</w:t>
+      </w:r>
       <w:r>
         <w:rPr>
           <w:rFonts w:ascii="B Nazanin" w:hAnsi="B Nazanin" w:cs="B Nazanin"/>
@@ -265,171 +332,7 @@
           <w:bCs/>
           <w:szCs w:val="20"/>
         </w:rPr>
-        <w:t>mojri_rep</w:t>
-      </w:r>
-      <w:proofErr w:type="spellEnd"/>
-      <w:r>
-        <w:rPr>
-          <w:rFonts w:ascii="B Nazanin" w:hAnsi="B Nazanin" w:cs="B Nazanin"/>
-          <w:b/>
-          <w:bCs/>
-          <w:szCs w:val="20"/>
-        </w:rPr>
-        <w:t>}</w:t>
-      </w:r>
-      <w:r>
-        <w:rPr>
-          <w:rFonts w:cs="B Nazanin"/>
-          <w:sz w:val="20"/>
-          <w:szCs w:val="20"/>
-        </w:rPr>
-        <w:t xml:space="preserve"> </w:t>
-      </w:r>
-      <w:r>
-        <w:rPr>
-          <w:rFonts w:cs="B Nazanin"/>
-          <w:sz w:val="20"/>
-          <w:szCs w:val="20"/>
-          <w:rtl/>
-        </w:rPr>
-        <w:t xml:space="preserve">بعنوان </w:t>
-      </w:r>
-      <w:r>
-        <w:rPr>
-          <w:rFonts w:ascii="B Nazanin" w:hAnsi="B Nazanin" w:cs="B Nazanin"/>
-          <w:b/>
-          <w:bCs/>
-          <w:szCs w:val="20"/>
-        </w:rPr>
-        <w:t>{</w:t>
-      </w:r>
-      <w:proofErr w:type="spellStart"/>
-      <w:r>
-        <w:rPr>
-          <w:rFonts w:ascii="B Nazanin" w:hAnsi="B Nazanin" w:cs="B Nazanin"/>
-          <w:b/>
-          <w:bCs/>
-          <w:szCs w:val="20"/>
-        </w:rPr>
-        <w:t>mojri_title</w:t>
-      </w:r>
-      <w:proofErr w:type="spellEnd"/>
-      <w:r>
-        <w:rPr>
-          <w:rFonts w:ascii="B Nazanin" w:hAnsi="B Nazanin" w:cs="B Nazanin"/>
-          <w:b/>
-          <w:bCs/>
-          <w:szCs w:val="20"/>
-        </w:rPr>
-        <w:t>}</w:t>
-      </w:r>
-      <w:r>
-        <w:rPr>
-          <w:rFonts w:cs="B Nazanin"/>
-          <w:sz w:val="20"/>
-          <w:szCs w:val="20"/>
-        </w:rPr>
-        <w:t xml:space="preserve"> </w:t>
-      </w:r>
-      <w:r>
-        <w:rPr>
-          <w:rFonts w:cs="B Nazanin"/>
-          <w:sz w:val="20"/>
-          <w:szCs w:val="20"/>
-          <w:rtl/>
-        </w:rPr>
-        <w:t>به آدرس</w:t>
-      </w:r>
-      <w:r>
-        <w:rPr>
-          <w:rFonts w:cs="B Nazanin"/>
-          <w:sz w:val="20"/>
-          <w:szCs w:val="20"/>
-        </w:rPr>
-        <w:t xml:space="preserve"> : </w:t>
-      </w:r>
-      <w:r>
-        <w:rPr>
-          <w:rFonts w:ascii="B Nazanin" w:hAnsi="B Nazanin" w:cs="B Nazanin"/>
-          <w:b/>
-          <w:bCs/>
-          <w:szCs w:val="20"/>
-        </w:rPr>
-        <w:t>{</w:t>
-      </w:r>
-      <w:proofErr w:type="spellStart"/>
-      <w:r>
-        <w:rPr>
-          <w:rFonts w:ascii="B Nazanin" w:hAnsi="B Nazanin" w:cs="B Nazanin"/>
-          <w:b/>
-          <w:bCs/>
-          <w:szCs w:val="20"/>
-        </w:rPr>
-        <w:t>mojri_address</w:t>
-      </w:r>
-      <w:proofErr w:type="spellEnd"/>
-      <w:r>
-        <w:rPr>
-          <w:rFonts w:ascii="B Nazanin" w:hAnsi="B Nazanin" w:cs="B Nazanin"/>
-          <w:b/>
-          <w:bCs/>
-          <w:szCs w:val="20"/>
-        </w:rPr>
-        <w:t>}</w:t>
-      </w:r>
-      <w:r>
-        <w:rPr>
-          <w:rFonts w:cs="B Nazanin"/>
-          <w:sz w:val="20"/>
-          <w:szCs w:val="20"/>
-        </w:rPr>
-        <w:t xml:space="preserve"> </w:t>
-      </w:r>
-      <w:r>
-        <w:rPr>
-          <w:rFonts w:cs="B Nazanin"/>
-          <w:sz w:val="20"/>
-          <w:szCs w:val="20"/>
-          <w:rtl/>
-        </w:rPr>
-        <w:t xml:space="preserve">به شماره </w:t>
-      </w:r>
-      <w:r>
-        <w:rPr>
-          <w:rFonts w:ascii="B Nazanin" w:hAnsi="B Nazanin" w:cs="B Nazanin"/>
-          <w:szCs w:val="20"/>
-          <w:rtl/>
-        </w:rPr>
-        <w:t>تماس</w:t>
-      </w:r>
-      <w:r>
-        <w:rPr>
-          <w:rFonts w:ascii="B Nazanin" w:hAnsi="B Nazanin" w:cs="B Nazanin"/>
-          <w:b/>
-          <w:bCs/>
-          <w:szCs w:val="20"/>
-        </w:rPr>
-        <w:t xml:space="preserve"> {</w:t>
-      </w:r>
-      <w:proofErr w:type="spellStart"/>
-      <w:r>
-        <w:rPr>
-          <w:rFonts w:ascii="B Nazanin" w:hAnsi="B Nazanin" w:cs="B Nazanin"/>
-          <w:b/>
-          <w:bCs/>
-          <w:szCs w:val="20"/>
-        </w:rPr>
-        <w:t>mojri_phone</w:t>
-      </w:r>
-      <w:proofErr w:type="spellEnd"/>
-      <w:r>
-        <w:rPr>
-          <w:rFonts w:ascii="B Nazanin" w:hAnsi="B Nazanin" w:cs="B Nazanin"/>
-          <w:b/>
-          <w:bCs/>
-          <w:szCs w:val="20"/>
-        </w:rPr>
-        <w:t>}</w:t>
+        <w:t xml:space="preserve"> {mojri_phone}</w:t>
       </w:r>
       <w:r>
         <w:rPr>
@@ -908,25 +811,57 @@
           <w:b/>
           <w:bCs/>
         </w:rPr>
-        <w:t>{</w:t>
-      </w:r>
-      <w:proofErr w:type="spellStart"/>
+        <w:t>{course_count}</w:t>
+      </w:r>
+      <w:r>
+        <w:rPr>
+          <w:rFonts w:cs="B Nazanin"/>
+          <w:sz w:val="20"/>
+          <w:szCs w:val="20"/>
+        </w:rPr>
+        <w:t xml:space="preserve"> </w:t>
+      </w:r>
+      <w:r>
+        <w:rPr>
+          <w:rFonts w:cs="B Nazanin"/>
+          <w:sz w:val="20"/>
+          <w:szCs w:val="20"/>
+          <w:rtl/>
+        </w:rPr>
+        <w:t xml:space="preserve">دوره کارگاه تحت عنوان </w:t>
+      </w:r>
       <w:r>
         <w:rPr>
           <w:rFonts w:ascii="B Nazanin" w:hAnsi="B Nazanin" w:cs="B Nazanin"/>
           <w:b/>
           <w:bCs/>
         </w:rPr>
-        <w:t>course_count</w:t>
-      </w:r>
-      <w:proofErr w:type="spellEnd"/>
+        <w:t>{course_name}</w:t>
+      </w:r>
+      <w:r>
+        <w:rPr>
+          <w:rFonts w:cs="B Nazanin"/>
+          <w:sz w:val="20"/>
+          <w:szCs w:val="20"/>
+        </w:rPr>
+        <w:t xml:space="preserve"> </w:t>
+      </w:r>
+      <w:r>
+        <w:rPr>
+          <w:rFonts w:cs="B Nazanin"/>
+          <w:sz w:val="20"/>
+          <w:szCs w:val="20"/>
+          <w:rtl/>
+        </w:rPr>
+        <w:t xml:space="preserve">با کد استاندارد </w:t>
+      </w:r>
       <w:r>
         <w:rPr>
           <w:rFonts w:ascii="B Nazanin" w:hAnsi="B Nazanin" w:cs="B Nazanin"/>
           <w:b/>
           <w:bCs/>
         </w:rPr>
-        <w:t>}</w:t>
+        <w:t>{standard_code}</w:t>
       </w:r>
       <w:r>
         <w:rPr>
@@ -943,7 +878,7 @@
           <w:szCs w:val="20"/>
           <w:rtl/>
         </w:rPr>
-        <w:t xml:space="preserve">دوره کارگاه تحت عنوان </w:t>
+        <w:t xml:space="preserve">به مدت </w:t>
       </w:r>
       <w:r>
         <w:rPr>
@@ -951,25 +886,57 @@
           <w:b/>
           <w:bCs/>
         </w:rPr>
-        <w:t>{</w:t>
-      </w:r>
-      <w:proofErr w:type="spellStart"/>
+        <w:t>{standard_hours}</w:t>
+      </w:r>
+      <w:r>
+        <w:rPr>
+          <w:rFonts w:cs="B Nazanin"/>
+          <w:sz w:val="20"/>
+          <w:szCs w:val="20"/>
+        </w:rPr>
+        <w:t xml:space="preserve"> </w:t>
+      </w:r>
+      <w:r>
+        <w:rPr>
+          <w:rFonts w:cs="B Nazanin"/>
+          <w:sz w:val="20"/>
+          <w:szCs w:val="20"/>
+          <w:rtl/>
+        </w:rPr>
+        <w:t xml:space="preserve">ساعت و تعداد </w:t>
+      </w:r>
       <w:r>
         <w:rPr>
           <w:rFonts w:ascii="B Nazanin" w:hAnsi="B Nazanin" w:cs="B Nazanin"/>
           <w:b/>
           <w:bCs/>
         </w:rPr>
-        <w:t>course_name</w:t>
-      </w:r>
-      <w:proofErr w:type="spellEnd"/>
+        <w:t>{student_count}</w:t>
+      </w:r>
+      <w:r>
+        <w:rPr>
+          <w:rFonts w:cs="B Nazanin"/>
+          <w:sz w:val="20"/>
+          <w:szCs w:val="20"/>
+        </w:rPr>
+        <w:t xml:space="preserve"> </w:t>
+      </w:r>
+      <w:r>
+        <w:rPr>
+          <w:rFonts w:cs="B Nazanin"/>
+          <w:sz w:val="20"/>
+          <w:szCs w:val="20"/>
+          <w:rtl/>
+        </w:rPr>
+        <w:t xml:space="preserve">نفر به میزان </w:t>
+      </w:r>
       <w:r>
         <w:rPr>
           <w:rFonts w:ascii="B Nazanin" w:hAnsi="B Nazanin" w:cs="B Nazanin"/>
           <w:b/>
           <w:bCs/>
         </w:rPr>
-        <w:t>}</w:t>
+        <w:t>{total_person_hours}</w:t>
       </w:r>
       <w:r>
         <w:rPr>
@@ -986,7 +953,7 @@
           <w:szCs w:val="20"/>
           <w:rtl/>
         </w:rPr>
-        <w:t xml:space="preserve">با کد استاندارد </w:t>
+        <w:t xml:space="preserve">نفر ساعت برای </w:t>
       </w:r>
       <w:r>
         <w:rPr>
@@ -994,197 +961,7 @@
           <w:b/>
           <w:bCs/>
         </w:rPr>
-        <w:t>{</w:t>
-      </w:r>
-      <w:proofErr w:type="spellStart"/>
-      <w:r>
-        <w:rPr>
-          <w:rFonts w:ascii="B Nazanin" w:hAnsi="B Nazanin" w:cs="B Nazanin"/>
-          <w:b/>
-          <w:bCs/>
-        </w:rPr>
-        <w:t>standard_code</w:t>
-      </w:r>
-      <w:proofErr w:type="spellEnd"/>
-      <w:r>
-        <w:rPr>
-          <w:rFonts w:ascii="B Nazanin" w:hAnsi="B Nazanin" w:cs="B Nazanin"/>
-          <w:b/>
-          <w:bCs/>
-        </w:rPr>
-        <w:t>}</w:t>
-      </w:r>
-      <w:r>
-        <w:rPr>
-          <w:rFonts w:cs="B Nazanin"/>
-          <w:sz w:val="20"/>
-          <w:szCs w:val="20"/>
-        </w:rPr>
-        <w:t xml:space="preserve"> </w:t>
-      </w:r>
-      <w:r>
-        <w:rPr>
-          <w:rFonts w:cs="B Nazanin"/>
-          <w:sz w:val="20"/>
-          <w:szCs w:val="20"/>
-          <w:rtl/>
-        </w:rPr>
-        <w:t xml:space="preserve">به مدت </w:t>
-      </w:r>
-      <w:r>
-        <w:rPr>
-          <w:rFonts w:ascii="B Nazanin" w:hAnsi="B Nazanin" w:cs="B Nazanin"/>
-          <w:b/>
-          <w:bCs/>
-        </w:rPr>
-        <w:t>{</w:t>
-      </w:r>
-      <w:proofErr w:type="spellStart"/>
-      <w:r>
-        <w:rPr>
-          <w:rFonts w:ascii="B Nazanin" w:hAnsi="B Nazanin" w:cs="B Nazanin"/>
-          <w:b/>
-          <w:bCs/>
-        </w:rPr>
-        <w:t>standard_hours</w:t>
-      </w:r>
-      <w:proofErr w:type="spellEnd"/>
-      <w:r>
-        <w:rPr>
-          <w:rFonts w:ascii="B Nazanin" w:hAnsi="B Nazanin" w:cs="B Nazanin"/>
-          <w:b/>
-          <w:bCs/>
-        </w:rPr>
-        <w:t>}</w:t>
-      </w:r>
-      <w:r>
-        <w:rPr>
-          <w:rFonts w:cs="B Nazanin"/>
-          <w:sz w:val="20"/>
-          <w:szCs w:val="20"/>
-        </w:rPr>
-        <w:t xml:space="preserve"> </w:t>
-      </w:r>
-      <w:r>
-        <w:rPr>
-          <w:rFonts w:cs="B Nazanin"/>
-          <w:sz w:val="20"/>
-          <w:szCs w:val="20"/>
-          <w:rtl/>
-        </w:rPr>
-        <w:t xml:space="preserve">ساعت و تعداد </w:t>
-      </w:r>
-      <w:r>
-        <w:rPr>
-          <w:rFonts w:ascii="B Nazanin" w:hAnsi="B Nazanin" w:cs="B Nazanin"/>
-          <w:b/>
-          <w:bCs/>
-        </w:rPr>
-        <w:t>{</w:t>
-      </w:r>
-      <w:proofErr w:type="spellStart"/>
-      <w:r>
-        <w:rPr>
-          <w:rFonts w:ascii="B Nazanin" w:hAnsi="B Nazanin" w:cs="B Nazanin"/>
-          <w:b/>
-          <w:bCs/>
-        </w:rPr>
-        <w:t>student_count</w:t>
-      </w:r>
-      <w:proofErr w:type="spellEnd"/>
-      <w:r>
-        <w:rPr>
-          <w:rFonts w:ascii="B Nazanin" w:hAnsi="B Nazanin" w:cs="B Nazanin"/>
-          <w:b/>
-          <w:bCs/>
-        </w:rPr>
-        <w:t>}</w:t>
-      </w:r>
-      <w:r>
-        <w:rPr>
-          <w:rFonts w:cs="B Nazanin"/>
-          <w:sz w:val="20"/>
-          <w:szCs w:val="20"/>
-        </w:rPr>
-        <w:t xml:space="preserve"> </w:t>
-      </w:r>
-      <w:r>
-        <w:rPr>
-          <w:rFonts w:cs="B Nazanin"/>
-          <w:sz w:val="20"/>
-          <w:szCs w:val="20"/>
-          <w:rtl/>
-        </w:rPr>
-        <w:t xml:space="preserve">نفر به میزان </w:t>
-      </w:r>
-      <w:r>
-        <w:rPr>
-          <w:rFonts w:ascii="B Nazanin" w:hAnsi="B Nazanin" w:cs="B Nazanin"/>
-          <w:b/>
-          <w:bCs/>
-        </w:rPr>
-        <w:t>{</w:t>
-      </w:r>
-      <w:proofErr w:type="spellStart"/>
-      <w:r>
-        <w:rPr>
-          <w:rFonts w:ascii="B Nazanin" w:hAnsi="B Nazanin" w:cs="B Nazanin"/>
-          <w:b/>
-          <w:bCs/>
-        </w:rPr>
-        <w:t>total_person_hours</w:t>
-      </w:r>
-      <w:proofErr w:type="spellEnd"/>
-      <w:r>
-        <w:rPr>
-          <w:rFonts w:ascii="B Nazanin" w:hAnsi="B Nazanin" w:cs="B Nazanin"/>
-          <w:b/>
-          <w:bCs/>
-        </w:rPr>
-        <w:t>}</w:t>
-      </w:r>
-      <w:r>
-        <w:rPr>
-          <w:rFonts w:cs="B Nazanin"/>
-          <w:sz w:val="20"/>
-          <w:szCs w:val="20"/>
-        </w:rPr>
-        <w:t xml:space="preserve"> </w:t>
-      </w:r>
-      <w:r>
-        <w:rPr>
-          <w:rFonts w:cs="B Nazanin"/>
-          <w:sz w:val="20"/>
-          <w:szCs w:val="20"/>
-          <w:rtl/>
-        </w:rPr>
-        <w:t xml:space="preserve">نفر ساعت برای </w:t>
-      </w:r>
-      <w:r>
-        <w:rPr>
-          <w:rFonts w:ascii="B Nazanin" w:hAnsi="B Nazanin" w:cs="B Nazanin"/>
-          <w:b/>
-          <w:bCs/>
-        </w:rPr>
-        <w:t>{</w:t>
-      </w:r>
-      <w:proofErr w:type="spellStart"/>
-      <w:r>
-        <w:rPr>
-          <w:rFonts w:ascii="B Nazanin" w:hAnsi="B Nazanin" w:cs="B Nazanin"/>
-          <w:b/>
-          <w:bCs/>
-        </w:rPr>
-        <w:t>target_audience</w:t>
-      </w:r>
-      <w:proofErr w:type="spellEnd"/>
-      <w:r>
-        <w:rPr>
-          <w:rFonts w:ascii="B Nazanin" w:hAnsi="B Nazanin" w:cs="B Nazanin"/>
-          <w:b/>
-          <w:bCs/>
-        </w:rPr>
-        <w:t xml:space="preserve">}. </w:t>
+        <w:t xml:space="preserve">{target_audience}. </w:t>
       </w:r>
     </w:p>
     <w:p>
@@ -1320,25 +1097,57 @@
           <w:b/>
           <w:bCs/>
         </w:rPr>
-        <w:t>{</w:t>
-      </w:r>
-      <w:proofErr w:type="spellStart"/>
+        <w:t>{course_count}</w:t>
+      </w:r>
+      <w:r>
+        <w:rPr>
+          <w:rFonts w:cs="B Nazanin"/>
+          <w:sz w:val="20"/>
+          <w:szCs w:val="20"/>
+        </w:rPr>
+        <w:t xml:space="preserve"> </w:t>
+      </w:r>
+      <w:r>
+        <w:rPr>
+          <w:rFonts w:cs="B Nazanin"/>
+          <w:sz w:val="20"/>
+          <w:szCs w:val="20"/>
+          <w:rtl/>
+        </w:rPr>
+        <w:t xml:space="preserve">دوره </w:t>
+      </w:r>
       <w:r>
         <w:rPr>
           <w:rFonts w:ascii="B Nazanin" w:hAnsi="B Nazanin" w:cs="B Nazanin"/>
           <w:b/>
           <w:bCs/>
         </w:rPr>
-        <w:t>course_count</w:t>
-      </w:r>
-      <w:proofErr w:type="spellEnd"/>
+        <w:t>{course_name}</w:t>
+      </w:r>
+      <w:r>
+        <w:rPr>
+          <w:rFonts w:cs="B Nazanin"/>
+          <w:sz w:val="20"/>
+          <w:szCs w:val="20"/>
+        </w:rPr>
+        <w:t xml:space="preserve"> </w:t>
+      </w:r>
+      <w:r>
+        <w:rPr>
+          <w:rFonts w:cs="B Nazanin"/>
+          <w:sz w:val="20"/>
+          <w:szCs w:val="20"/>
+          <w:rtl/>
+        </w:rPr>
+        <w:t xml:space="preserve">با احتساب تعداد </w:t>
+      </w:r>
       <w:r>
         <w:rPr>
           <w:rFonts w:ascii="B Nazanin" w:hAnsi="B Nazanin" w:cs="B Nazanin"/>
           <w:b/>
           <w:bCs/>
         </w:rPr>
-        <w:t>}</w:t>
+        <w:t>{student_count}</w:t>
       </w:r>
       <w:r>
         <w:rPr>
@@ -1355,7 +1164,7 @@
           <w:szCs w:val="20"/>
           <w:rtl/>
         </w:rPr>
-        <w:t xml:space="preserve">دوره </w:t>
+        <w:t xml:space="preserve">نفر جامعه هدف و اجرای مشارکتی و تامین کلیه هزینه های آموزشی از طریق </w:t>
       </w:r>
       <w:r>
         <w:rPr>
@@ -1363,25 +1172,32 @@
           <w:b/>
           <w:bCs/>
         </w:rPr>
-        <w:t>{</w:t>
-      </w:r>
-      <w:proofErr w:type="spellStart"/>
+        <w:t>{funding_source}</w:t>
+      </w:r>
+      <w:r>
+        <w:rPr>
+          <w:rFonts w:cs="B Nazanin"/>
+          <w:sz w:val="20"/>
+          <w:szCs w:val="20"/>
+        </w:rPr>
+        <w:t xml:space="preserve"> </w:t>
+      </w:r>
+      <w:r>
+        <w:rPr>
+          <w:rFonts w:cs="B Nazanin"/>
+          <w:sz w:val="20"/>
+          <w:szCs w:val="20"/>
+          <w:rtl/>
+        </w:rPr>
+        <w:t xml:space="preserve">و نظارت و صدور گواهینامه ها توسط اداره کل آموزش فنی و حرفه ای مبلغ کل قرارداد </w:t>
+      </w:r>
       <w:r>
         <w:rPr>
           <w:rFonts w:ascii="B Nazanin" w:hAnsi="B Nazanin" w:cs="B Nazanin"/>
           <w:b/>
           <w:bCs/>
         </w:rPr>
-        <w:t>course_name</w:t>
-      </w:r>
-      <w:proofErr w:type="spellEnd"/>
-      <w:r>
-        <w:rPr>
-          <w:rFonts w:ascii="B Nazanin" w:hAnsi="B Nazanin" w:cs="B Nazanin"/>
-          <w:b/>
-          <w:bCs/>
-        </w:rPr>
-        <w:t>}</w:t>
+        <w:t>{contract_total_amount}</w:t>
       </w:r>
       <w:r>
         <w:rPr>
@@ -1398,135 +1214,6 @@
           <w:szCs w:val="20"/>
           <w:rtl/>
         </w:rPr>
-        <w:t xml:space="preserve">با احتساب تعداد </w:t>
-      </w:r>
-      <w:r>
-        <w:rPr>
-          <w:rFonts w:ascii="B Nazanin" w:hAnsi="B Nazanin" w:cs="B Nazanin"/>
-          <w:b/>
-          <w:bCs/>
-        </w:rPr>
-        <w:t>{</w:t>
-      </w:r>
-      <w:proofErr w:type="spellStart"/>
-      <w:r>
-        <w:rPr>
-          <w:rFonts w:ascii="B Nazanin" w:hAnsi="B Nazanin" w:cs="B Nazanin"/>
-          <w:b/>
-          <w:bCs/>
-        </w:rPr>
-        <w:t>student_count</w:t>
-      </w:r>
-      <w:proofErr w:type="spellEnd"/>
-      <w:r>
-        <w:rPr>
-          <w:rFonts w:ascii="B Nazanin" w:hAnsi="B Nazanin" w:cs="B Nazanin"/>
-          <w:b/>
-          <w:bCs/>
-        </w:rPr>
-        <w:t>}</w:t>
-      </w:r>
-      <w:r>
-        <w:rPr>
-          <w:rFonts w:cs="B Nazanin"/>
-          <w:sz w:val="20"/>
-          <w:szCs w:val="20"/>
-        </w:rPr>
-        <w:t xml:space="preserve"> </w:t>
-      </w:r>
-      <w:r>
-        <w:rPr>
-          <w:rFonts w:cs="B Nazanin"/>
-          <w:sz w:val="20"/>
-          <w:szCs w:val="20"/>
-          <w:rtl/>
-        </w:rPr>
-        <w:t xml:space="preserve">نفر جامعه هدف و اجرای مشارکتی و تامین کلیه هزینه های آموزشی از طریق </w:t>
-      </w:r>
-      <w:r>
-        <w:rPr>
-          <w:rFonts w:ascii="B Nazanin" w:hAnsi="B Nazanin" w:cs="B Nazanin"/>
-          <w:b/>
-          <w:bCs/>
-        </w:rPr>
-        <w:t>{</w:t>
-      </w:r>
-      <w:proofErr w:type="spellStart"/>
-      <w:r>
-        <w:rPr>
-          <w:rFonts w:ascii="B Nazanin" w:hAnsi="B Nazanin" w:cs="B Nazanin"/>
-          <w:b/>
-          <w:bCs/>
-        </w:rPr>
-        <w:t>funding_source</w:t>
-      </w:r>
-      <w:proofErr w:type="spellEnd"/>
-      <w:r>
-        <w:rPr>
-          <w:rFonts w:ascii="B Nazanin" w:hAnsi="B Nazanin" w:cs="B Nazanin"/>
-          <w:b/>
-          <w:bCs/>
-        </w:rPr>
-        <w:t>}</w:t>
-      </w:r>
-      <w:r>
-        <w:rPr>
-          <w:rFonts w:cs="B Nazanin"/>
-          <w:sz w:val="20"/>
-          <w:szCs w:val="20"/>
-        </w:rPr>
-        <w:t xml:space="preserve"> </w:t>
-      </w:r>
-      <w:r>
-        <w:rPr>
-          <w:rFonts w:cs="B Nazanin"/>
-          <w:sz w:val="20"/>
-          <w:szCs w:val="20"/>
-          <w:rtl/>
-        </w:rPr>
-        <w:t xml:space="preserve">و نظارت و صدور گواهینامه ها توسط اداره کل آموزش فنی و حرفه ای مبلغ کل قرارداد </w:t>
-      </w:r>
-      <w:r>
-        <w:rPr>
-          <w:rFonts w:ascii="B Nazanin" w:hAnsi="B Nazanin" w:cs="B Nazanin"/>
-          <w:b/>
-          <w:bCs/>
-        </w:rPr>
-        <w:t>{</w:t>
-      </w:r>
-      <w:proofErr w:type="spellStart"/>
-      <w:r>
-        <w:rPr>
-          <w:rFonts w:ascii="B Nazanin" w:hAnsi="B Nazanin" w:cs="B Nazanin"/>
-          <w:b/>
-          <w:bCs/>
-        </w:rPr>
-        <w:t>contract_total_amount</w:t>
-      </w:r>
-      <w:proofErr w:type="spellEnd"/>
-      <w:r>
-        <w:rPr>
-          <w:rFonts w:ascii="B Nazanin" w:hAnsi="B Nazanin" w:cs="B Nazanin"/>
-          <w:b/>
-          <w:bCs/>
-        </w:rPr>
-        <w:t>}</w:t>
-      </w:r>
-      <w:r>
-        <w:rPr>
-          <w:rFonts w:cs="B Nazanin"/>
-          <w:sz w:val="20"/>
-          <w:szCs w:val="20"/>
-        </w:rPr>
-        <w:t xml:space="preserve"> </w:t>
-      </w:r>
-      <w:r>
-        <w:rPr>
-          <w:rFonts w:cs="B Nazanin"/>
-          <w:sz w:val="20"/>
-          <w:szCs w:val="20"/>
-          <w:rtl/>
-        </w:rPr>
         <w:t xml:space="preserve">ریال </w:t>
       </w:r>
       <w:r>
@@ -1534,7 +1221,6 @@
           <w:rFonts w:cs="B Nazanin"/>
           <w:sz w:val="20"/>
           <w:szCs w:val="20"/>
-          <w:highlight w:val="cyan"/>
           <w:rtl/>
         </w:rPr>
         <w:t>(بدون احتساب هزینه صدور گواهینامه)</w:t>
@@ -1620,34 +1306,66 @@
           <w:b/>
           <w:bCs/>
         </w:rPr>
-        <w:t>{</w:t>
-      </w:r>
-      <w:proofErr w:type="spellStart"/>
+        <w:t xml:space="preserve">{reg_fee_per_person} </w:t>
+      </w:r>
+      <w:r>
+        <w:rPr>
+          <w:rFonts w:cs="B Nazanin"/>
+          <w:sz w:val="20"/>
+          <w:szCs w:val="20"/>
+          <w:rtl/>
+        </w:rPr>
+        <w:t xml:space="preserve">ریال و هزینه مشاوره </w:t>
+      </w:r>
       <w:r>
         <w:rPr>
           <w:rFonts w:ascii="B Nazanin" w:hAnsi="B Nazanin" w:cs="B Nazanin"/>
           <w:b/>
           <w:bCs/>
         </w:rPr>
-        <w:t>reg_fee_per_person</w:t>
-      </w:r>
-      <w:proofErr w:type="spellEnd"/>
+        <w:t>{consult_fee_per_person}</w:t>
+      </w:r>
+      <w:r>
+        <w:rPr>
+          <w:rFonts w:cs="B Nazanin"/>
+          <w:sz w:val="20"/>
+          <w:szCs w:val="20"/>
+        </w:rPr>
+        <w:t xml:space="preserve"> </w:t>
+      </w:r>
+      <w:r>
+        <w:rPr>
+          <w:rFonts w:cs="B Nazanin"/>
+          <w:sz w:val="20"/>
+          <w:szCs w:val="20"/>
+          <w:rtl/>
+        </w:rPr>
+        <w:t xml:space="preserve">ریال در مجموع مبلغ </w:t>
+      </w:r>
       <w:r>
         <w:rPr>
           <w:rFonts w:ascii="B Nazanin" w:hAnsi="B Nazanin" w:cs="B Nazanin"/>
           <w:b/>
           <w:bCs/>
         </w:rPr>
-        <w:t xml:space="preserve">} </w:t>
-      </w:r>
-      <w:r>
-        <w:rPr>
-          <w:rFonts w:cs="B Nazanin"/>
-          <w:sz w:val="20"/>
-          <w:szCs w:val="20"/>
-          <w:rtl/>
-        </w:rPr>
-        <w:t xml:space="preserve">ریال و هزینه مشاوره </w:t>
+        <w:t>{total_reg_consult_per_person}</w:t>
+      </w:r>
+      <w:r>
+        <w:rPr>
+          <w:rFonts w:cs="B Nazanin"/>
+          <w:sz w:val="20"/>
+          <w:szCs w:val="20"/>
+        </w:rPr>
+        <w:t xml:space="preserve"> </w:t>
+      </w:r>
+      <w:r>
+        <w:rPr>
+          <w:rFonts w:cs="B Nazanin"/>
+          <w:sz w:val="20"/>
+          <w:szCs w:val="20"/>
+          <w:rtl/>
+        </w:rPr>
+        <w:t xml:space="preserve">ریال برای هرنفر، جمعاً بابت </w:t>
       </w:r>
       <w:r>
         <w:rPr>
@@ -1655,154 +1373,32 @@
           <w:b/>
           <w:bCs/>
         </w:rPr>
-        <w:t>{</w:t>
-      </w:r>
-      <w:proofErr w:type="spellStart"/>
+        <w:t>{student_count}</w:t>
+      </w:r>
+      <w:r>
+        <w:rPr>
+          <w:rFonts w:cs="B Nazanin"/>
+          <w:sz w:val="20"/>
+          <w:szCs w:val="20"/>
+        </w:rPr>
+        <w:t xml:space="preserve"> </w:t>
+      </w:r>
+      <w:r>
+        <w:rPr>
+          <w:rFonts w:cs="B Nazanin"/>
+          <w:sz w:val="20"/>
+          <w:szCs w:val="20"/>
+          <w:rtl/>
+        </w:rPr>
+        <w:t xml:space="preserve">نفر مبلغ </w:t>
+      </w:r>
       <w:r>
         <w:rPr>
           <w:rFonts w:ascii="B Nazanin" w:hAnsi="B Nazanin" w:cs="B Nazanin"/>
           <w:b/>
           <w:bCs/>
         </w:rPr>
-        <w:t>consult_fee_per_person</w:t>
-      </w:r>
-      <w:proofErr w:type="spellEnd"/>
-      <w:r>
-        <w:rPr>
-          <w:rFonts w:ascii="B Nazanin" w:hAnsi="B Nazanin" w:cs="B Nazanin"/>
-          <w:b/>
-          <w:bCs/>
-        </w:rPr>
-        <w:t>}</w:t>
-      </w:r>
-      <w:r>
-        <w:rPr>
-          <w:rFonts w:cs="B Nazanin"/>
-          <w:sz w:val="20"/>
-          <w:szCs w:val="20"/>
-        </w:rPr>
-        <w:t xml:space="preserve"> </w:t>
-      </w:r>
-      <w:r>
-        <w:rPr>
-          <w:rFonts w:cs="B Nazanin"/>
-          <w:sz w:val="20"/>
-          <w:szCs w:val="20"/>
-          <w:rtl/>
-        </w:rPr>
-        <w:t xml:space="preserve">ریال در مجموع مبلغ </w:t>
-      </w:r>
-      <w:r>
-        <w:rPr>
-          <w:rFonts w:ascii="B Nazanin" w:hAnsi="B Nazanin" w:cs="B Nazanin"/>
-          <w:b/>
-          <w:bCs/>
-        </w:rPr>
-        <w:t>{</w:t>
-      </w:r>
-      <w:proofErr w:type="spellStart"/>
-      <w:r>
-        <w:rPr>
-          <w:rFonts w:ascii="B Nazanin" w:hAnsi="B Nazanin" w:cs="B Nazanin"/>
-          <w:b/>
-          <w:bCs/>
-        </w:rPr>
-        <w:t>total_reg_consult_per_person</w:t>
-      </w:r>
-      <w:proofErr w:type="spellEnd"/>
-      <w:r>
-        <w:rPr>
-          <w:rFonts w:ascii="B Nazanin" w:hAnsi="B Nazanin" w:cs="B Nazanin"/>
-          <w:b/>
-          <w:bCs/>
-        </w:rPr>
-        <w:t>}</w:t>
-      </w:r>
-      <w:r>
-        <w:rPr>
-          <w:rFonts w:cs="B Nazanin"/>
-          <w:sz w:val="20"/>
-          <w:szCs w:val="20"/>
-        </w:rPr>
-        <w:t xml:space="preserve"> </w:t>
-      </w:r>
-      <w:r>
-        <w:rPr>
-          <w:rFonts w:cs="B Nazanin"/>
-          <w:sz w:val="20"/>
-          <w:szCs w:val="20"/>
-          <w:rtl/>
-        </w:rPr>
-        <w:t xml:space="preserve">ریال برای هرنفر، جمعاً بابت </w:t>
-      </w:r>
-      <w:r>
-        <w:rPr>
-          <w:rFonts w:ascii="B Nazanin" w:hAnsi="B Nazanin" w:cs="B Nazanin"/>
-          <w:b/>
-          <w:bCs/>
-        </w:rPr>
-        <w:t>{</w:t>
-      </w:r>
-      <w:proofErr w:type="spellStart"/>
-      <w:r>
-        <w:rPr>
-          <w:rFonts w:ascii="B Nazanin" w:hAnsi="B Nazanin" w:cs="B Nazanin"/>
-          <w:b/>
-          <w:bCs/>
-        </w:rPr>
-        <w:t>student_count</w:t>
-      </w:r>
-      <w:proofErr w:type="spellEnd"/>
-      <w:r>
-        <w:rPr>
-          <w:rFonts w:ascii="B Nazanin" w:hAnsi="B Nazanin" w:cs="B Nazanin"/>
-          <w:b/>
-          <w:bCs/>
-        </w:rPr>
-        <w:t>}</w:t>
-      </w:r>
-      <w:r>
-        <w:rPr>
-          <w:rFonts w:cs="B Nazanin"/>
-          <w:sz w:val="20"/>
-          <w:szCs w:val="20"/>
-        </w:rPr>
-        <w:t xml:space="preserve"> </w:t>
-      </w:r>
-      <w:r>
-        <w:rPr>
-          <w:rFonts w:cs="B Nazanin"/>
-          <w:sz w:val="20"/>
-          <w:szCs w:val="20"/>
-          <w:rtl/>
-        </w:rPr>
-        <w:t xml:space="preserve">نفر مبلغ </w:t>
-      </w:r>
-      <w:r>
-        <w:rPr>
-          <w:rFonts w:ascii="B Nazanin" w:hAnsi="B Nazanin" w:cs="B Nazanin"/>
-          <w:b/>
-          <w:bCs/>
-        </w:rPr>
-        <w:t>{</w:t>
-      </w:r>
-      <w:proofErr w:type="spellStart"/>
-      <w:r>
-        <w:rPr>
-          <w:rFonts w:ascii="B Nazanin" w:hAnsi="B Nazanin" w:cs="B Nazanin"/>
-          <w:b/>
-          <w:bCs/>
-        </w:rPr>
-        <w:t>total_reg_consult_all</w:t>
-      </w:r>
-      <w:proofErr w:type="spellEnd"/>
-      <w:r>
-        <w:rPr>
-          <w:rFonts w:ascii="B Nazanin" w:hAnsi="B Nazanin" w:cs="B Nazanin"/>
-          <w:b/>
-          <w:bCs/>
-        </w:rPr>
-        <w:t>}</w:t>
+        <w:t>{total_reg_consult_all}</w:t>
       </w:r>
       <w:r>
         <w:rPr>
@@ -1893,24 +1489,47 @@
           <w:b/>
           <w:bCs/>
         </w:rPr>
-        <w:t>{</w:t>
-      </w:r>
-      <w:proofErr w:type="spellStart"/>
+        <w:t>{tiered_cost_per_person}</w:t>
+      </w:r>
+      <w:r>
+        <w:rPr>
+          <w:rFonts w:cs="B Nazanin"/>
+          <w:sz w:val="20"/>
+          <w:szCs w:val="20"/>
+        </w:rPr>
+        <w:t xml:space="preserve"> </w:t>
+      </w:r>
+      <w:r>
+        <w:rPr>
+          <w:rFonts w:cs="B Nazanin"/>
+          <w:sz w:val="20"/>
+          <w:szCs w:val="20"/>
+          <w:rtl/>
+        </w:rPr>
+        <w:t xml:space="preserve">ریال که جمعا بابت </w:t>
+      </w:r>
       <w:r>
         <w:rPr>
           <w:rFonts w:ascii="B Nazanin" w:hAnsi="B Nazanin" w:cs="B Nazanin"/>
           <w:b/>
           <w:bCs/>
         </w:rPr>
-        <w:t>tiered_cost_per_person</w:t>
-      </w:r>
-      <w:proofErr w:type="spellEnd"/>
+        <w:t>{student_count</w:t>
+      </w:r>
       <w:r>
         <w:rPr>
           <w:rFonts w:ascii="B Nazanin" w:hAnsi="B Nazanin" w:cs="B Nazanin"/>
           <w:b/>
           <w:bCs/>
         </w:rPr>
+        <w:t>-dahak</w:t>
+      </w:r>
+      <w:r>
+        <w:rPr>
+          <w:rFonts w:ascii="B Nazanin" w:hAnsi="B Nazanin" w:cs="B Nazanin"/>
+          <w:b/>
+          <w:bCs/>
+        </w:rPr>
         <w:t>}</w:t>
       </w:r>
       <w:r>
@@ -1928,7 +1547,7 @@
           <w:szCs w:val="20"/>
           <w:rtl/>
         </w:rPr>
-        <w:t xml:space="preserve">ریال که جمعا بابت </w:t>
+        <w:t xml:space="preserve">نفر مبلغ </w:t>
       </w:r>
       <w:r>
         <w:rPr>
@@ -1936,88 +1555,41 @@
           <w:b/>
           <w:bCs/>
         </w:rPr>
-        <w:t>{</w:t>
-      </w:r>
-      <w:proofErr w:type="spellStart"/>
-      <w:r>
-        <w:rPr>
-          <w:rFonts w:ascii="B Nazanin" w:hAnsi="B Nazanin" w:cs="B Nazanin"/>
-          <w:b/>
-          <w:bCs/>
-        </w:rPr>
-        <w:t>student_count</w:t>
-      </w:r>
-      <w:r>
-        <w:rPr>
-          <w:rFonts w:ascii="B Nazanin" w:hAnsi="B Nazanin" w:cs="B Nazanin"/>
-          <w:b/>
-          <w:bCs/>
-        </w:rPr>
-        <w:t>-dahak</w:t>
-      </w:r>
-      <w:proofErr w:type="spellEnd"/>
-      <w:r>
-        <w:rPr>
-          <w:rFonts w:ascii="B Nazanin" w:hAnsi="B Nazanin" w:cs="B Nazanin"/>
-          <w:b/>
-          <w:bCs/>
-        </w:rPr>
-        <w:t>}</w:t>
-      </w:r>
-      <w:r>
-        <w:rPr>
-          <w:rFonts w:cs="B Nazanin"/>
-          <w:sz w:val="20"/>
-          <w:szCs w:val="20"/>
+        <w:t xml:space="preserve">{total_tiered_cost} </w:t>
+      </w:r>
+      <w:r>
+        <w:rPr>
+          <w:rFonts w:cs="B Nazanin"/>
+          <w:sz w:val="20"/>
+          <w:szCs w:val="20"/>
+          <w:rtl/>
+        </w:rPr>
+        <w:t xml:space="preserve">ریال میباشد که از طریق پورتال سازمان آموزش فنی و حرفه‌ای کشور توسط </w:t>
+      </w:r>
+      <w:r>
+        <w:rPr>
+          <w:rFonts w:cs="B Nazanin" w:hint="cs"/>
+          <w:b/>
+          <w:bCs/>
+          <w:sz w:val="20"/>
+          <w:szCs w:val="20"/>
+          <w:rtl/>
+        </w:rPr>
+        <w:t>طرف اول</w:t>
+      </w:r>
+      <w:r>
+        <w:rPr>
+          <w:rFonts w:cs="B Nazanin" w:hint="cs"/>
+          <w:b/>
+          <w:bCs/>
+          <w:sz w:val="20"/>
+          <w:szCs w:val="20"/>
+          <w:rtl/>
         </w:rPr>
         <w:t xml:space="preserve"> </w:t>
       </w:r>
       <w:r>
         <w:rPr>
-          <w:rFonts w:cs="B Nazanin"/>
-          <w:sz w:val="20"/>
-          <w:szCs w:val="20"/>
-          <w:rtl/>
-        </w:rPr>
-        <w:t xml:space="preserve">نفر مبلغ </w:t>
-      </w:r>
-      <w:r>
-        <w:rPr>
-          <w:rFonts w:ascii="B Nazanin" w:hAnsi="B Nazanin" w:cs="B Nazanin"/>
-          <w:b/>
-          <w:bCs/>
-        </w:rPr>
-        <w:t>{</w:t>
-      </w:r>
-      <w:proofErr w:type="spellStart"/>
-      <w:r>
-        <w:rPr>
-          <w:rFonts w:ascii="B Nazanin" w:hAnsi="B Nazanin" w:cs="B Nazanin"/>
-          <w:b/>
-          <w:bCs/>
-        </w:rPr>
-        <w:t>total_tiered_cost</w:t>
-      </w:r>
-      <w:proofErr w:type="spellEnd"/>
-      <w:r>
-        <w:rPr>
-          <w:rFonts w:ascii="B Nazanin" w:hAnsi="B Nazanin" w:cs="B Nazanin"/>
-          <w:b/>
-          <w:bCs/>
-        </w:rPr>
-        <w:t xml:space="preserve">} </w:t>
-      </w:r>
-      <w:r>
-        <w:rPr>
-          <w:rFonts w:cs="B Nazanin"/>
-          <w:sz w:val="20"/>
-          <w:szCs w:val="20"/>
-          <w:rtl/>
-        </w:rPr>
-        <w:t xml:space="preserve">ریال میباشد که از طریق پورتال سازمان آموزش فنی و حرفه‌ای کشور توسط </w:t>
-      </w:r>
-      <w:r>
-        <w:rPr>
           <w:rFonts w:cs="B Nazanin" w:hint="cs"/>
           <w:b/>
           <w:bCs/>
@@ -2025,7 +1597,18 @@
           <w:szCs w:val="20"/>
           <w:rtl/>
         </w:rPr>
-        <w:t xml:space="preserve">طرف اول </w:t>
+        <w:t xml:space="preserve">/ کارآموز  </w:t>
+      </w:r>
+      <w:r>
+        <w:rPr>
+          <w:rFonts w:cs="B Nazanin" w:hint="cs"/>
+          <w:b/>
+          <w:bCs/>
+          <w:sz w:val="20"/>
+          <w:szCs w:val="20"/>
+          <w:rtl/>
+        </w:rPr>
+        <w:t xml:space="preserve"> </w:t>
       </w:r>
       <w:r>
         <w:rPr>
@@ -2117,7 +1700,16 @@
           <w:szCs w:val="20"/>
           <w:rtl/>
         </w:rPr>
-        <w:t>سال ۱۴۰۵ به ازای هر نفر در رشته</w:t>
+        <w:t xml:space="preserve">سال ۱۴۰۵ به ازای هر نفر در </w:t>
+      </w:r>
+      <w:r>
+        <w:rPr>
+          <w:rFonts w:cs="B Nazanin" w:hint="cs"/>
+          <w:sz w:val="20"/>
+          <w:szCs w:val="20"/>
+          <w:rtl/>
+        </w:rPr>
+        <w:t>خوشه</w:t>
       </w:r>
       <w:r>
         <w:rPr>
@@ -2127,16 +1719,14 @@
         </w:rPr>
         <w:t>{</w:t>
       </w:r>
-      <w:proofErr w:type="spellStart"/>
       <w:r>
         <w:rPr>
           <w:rFonts w:ascii="B Nazanin" w:hAnsi="B Nazanin" w:cs="B Nazanin"/>
           <w:b/>
           <w:bCs/>
         </w:rPr>
-        <w:t>course_name</w:t>
-      </w:r>
-      <w:proofErr w:type="spellEnd"/>
+        <w:t>khoshe</w:t>
+      </w:r>
       <w:r>
         <w:rPr>
           <w:rFonts w:ascii="B Nazanin" w:hAnsi="B Nazanin" w:cs="B Nazanin"/>
@@ -2176,25 +1766,57 @@
           <w:b/>
           <w:bCs/>
         </w:rPr>
-        <w:t>{</w:t>
-      </w:r>
-      <w:proofErr w:type="spellStart"/>
+        <w:t>{exam_fee_per_person}</w:t>
+      </w:r>
+      <w:r>
+        <w:rPr>
+          <w:rFonts w:cs="B Nazanin"/>
+          <w:sz w:val="20"/>
+          <w:szCs w:val="20"/>
+        </w:rPr>
+        <w:t xml:space="preserve"> </w:t>
+      </w:r>
+      <w:r>
+        <w:rPr>
+          <w:rFonts w:cs="B Nazanin"/>
+          <w:sz w:val="20"/>
+          <w:szCs w:val="20"/>
+          <w:rtl/>
+        </w:rPr>
+        <w:t xml:space="preserve">ریال که جمعا بابت </w:t>
+      </w:r>
       <w:r>
         <w:rPr>
           <w:rFonts w:ascii="B Nazanin" w:hAnsi="B Nazanin" w:cs="B Nazanin"/>
           <w:b/>
           <w:bCs/>
         </w:rPr>
-        <w:t>exam_fee_per_person</w:t>
-      </w:r>
-      <w:proofErr w:type="spellEnd"/>
+        <w:t>{student_count}</w:t>
+      </w:r>
+      <w:r>
+        <w:rPr>
+          <w:rFonts w:cs="B Nazanin"/>
+          <w:sz w:val="20"/>
+          <w:szCs w:val="20"/>
+        </w:rPr>
+        <w:t xml:space="preserve"> </w:t>
+      </w:r>
+      <w:r>
+        <w:rPr>
+          <w:rFonts w:cs="B Nazanin"/>
+          <w:sz w:val="20"/>
+          <w:szCs w:val="20"/>
+          <w:rtl/>
+        </w:rPr>
+        <w:t xml:space="preserve">نفر مبلغ </w:t>
+      </w:r>
       <w:r>
         <w:rPr>
           <w:rFonts w:ascii="B Nazanin" w:hAnsi="B Nazanin" w:cs="B Nazanin"/>
           <w:b/>
           <w:bCs/>
         </w:rPr>
-        <w:t>}</w:t>
+        <w:t>{total_exam_fee}</w:t>
       </w:r>
       <w:r>
         <w:rPr>
@@ -2211,93 +1833,16 @@
           <w:szCs w:val="20"/>
           <w:rtl/>
         </w:rPr>
-        <w:t xml:space="preserve">ریال که جمعا بابت </w:t>
-      </w:r>
-      <w:r>
-        <w:rPr>
-          <w:rFonts w:ascii="B Nazanin" w:hAnsi="B Nazanin" w:cs="B Nazanin"/>
-          <w:b/>
-          <w:bCs/>
-        </w:rPr>
-        <w:t>{</w:t>
-      </w:r>
-      <w:proofErr w:type="spellStart"/>
-      <w:r>
-        <w:rPr>
-          <w:rFonts w:ascii="B Nazanin" w:hAnsi="B Nazanin" w:cs="B Nazanin"/>
-          <w:b/>
-          <w:bCs/>
-        </w:rPr>
-        <w:t>student_count</w:t>
-      </w:r>
-      <w:proofErr w:type="spellEnd"/>
-      <w:r>
-        <w:rPr>
-          <w:rFonts w:ascii="B Nazanin" w:hAnsi="B Nazanin" w:cs="B Nazanin"/>
-          <w:b/>
-          <w:bCs/>
-        </w:rPr>
-        <w:t>}</w:t>
-      </w:r>
-      <w:r>
-        <w:rPr>
-          <w:rFonts w:cs="B Nazanin"/>
-          <w:sz w:val="20"/>
-          <w:szCs w:val="20"/>
-        </w:rPr>
-        <w:t xml:space="preserve"> </w:t>
-      </w:r>
-      <w:r>
-        <w:rPr>
-          <w:rFonts w:cs="B Nazanin"/>
-          <w:sz w:val="20"/>
-          <w:szCs w:val="20"/>
-          <w:rtl/>
-        </w:rPr>
-        <w:t xml:space="preserve">نفر مبلغ </w:t>
-      </w:r>
-      <w:r>
-        <w:rPr>
-          <w:rFonts w:ascii="B Nazanin" w:hAnsi="B Nazanin" w:cs="B Nazanin"/>
-          <w:b/>
-          <w:bCs/>
-        </w:rPr>
-        <w:t>{</w:t>
-      </w:r>
-      <w:proofErr w:type="spellStart"/>
-      <w:r>
-        <w:rPr>
-          <w:rFonts w:ascii="B Nazanin" w:hAnsi="B Nazanin" w:cs="B Nazanin"/>
-          <w:b/>
-          <w:bCs/>
-        </w:rPr>
-        <w:t>total_exam_fee</w:t>
-      </w:r>
-      <w:proofErr w:type="spellEnd"/>
-      <w:r>
-        <w:rPr>
-          <w:rFonts w:ascii="B Nazanin" w:hAnsi="B Nazanin" w:cs="B Nazanin"/>
-          <w:b/>
-          <w:bCs/>
-        </w:rPr>
-        <w:t>}</w:t>
-      </w:r>
-      <w:r>
-        <w:rPr>
-          <w:rFonts w:cs="B Nazanin"/>
-          <w:sz w:val="20"/>
-          <w:szCs w:val="20"/>
-        </w:rPr>
-        <w:t xml:space="preserve"> </w:t>
-      </w:r>
-      <w:r>
-        <w:rPr>
-          <w:rFonts w:cs="B Nazanin"/>
-          <w:sz w:val="20"/>
-          <w:szCs w:val="20"/>
-          <w:rtl/>
-        </w:rPr>
         <w:t xml:space="preserve">ریال میباشد و هزینه صدور گواهینامه به ازای هر نفر </w:t>
+      </w:r>
+      <w:r>
+        <w:rPr>
+          <w:rFonts w:cs="B Nazanin"/>
+          <w:sz w:val="20"/>
+          <w:szCs w:val="20"/>
+          <w:rtl/>
+        </w:rPr>
+        <w:t>۱.۵۰۰.۰۰۰ ریال</w:t>
       </w:r>
       <w:r>
         <w:rPr>
@@ -2306,40 +1851,6 @@
           <w:bCs/>
           <w:sz w:val="24"/>
           <w:szCs w:val="24"/>
-          <w:highlight w:val="cyan"/>
-          <w:rtl/>
-        </w:rPr>
-        <w:t>۱.۵۰۰</w:t>
-      </w:r>
-      <w:r>
-        <w:rPr>
-          <w:rFonts w:cs="B Nazanin"/>
-          <w:sz w:val="20"/>
-          <w:szCs w:val="20"/>
-          <w:highlight w:val="cyan"/>
-          <w:rtl/>
-        </w:rPr>
-        <w:t>.</w:t>
-      </w:r>
-      <w:r>
-        <w:rPr>
-          <w:rFonts w:cs="B Nazanin"/>
-          <w:b/>
-          <w:bCs/>
-          <w:sz w:val="24"/>
-          <w:szCs w:val="24"/>
-          <w:highlight w:val="cyan"/>
-          <w:rtl/>
-        </w:rPr>
-        <w:t>۰۰۰ ریال</w:t>
-      </w:r>
-      <w:r>
-        <w:rPr>
-          <w:rFonts w:cs="B Nazanin"/>
-          <w:b/>
-          <w:bCs/>
-          <w:sz w:val="24"/>
-          <w:szCs w:val="24"/>
           <w:rtl/>
         </w:rPr>
         <w:t xml:space="preserve"> </w:t>
@@ -2359,60 +1870,24 @@
           <w:b/>
           <w:bCs/>
         </w:rPr>
-        <w:t>{</w:t>
-      </w:r>
-      <w:proofErr w:type="spellStart"/>
+        <w:t xml:space="preserve">{student_count} </w:t>
+      </w:r>
+      <w:r>
+        <w:rPr>
+          <w:rFonts w:cs="B Nazanin"/>
+          <w:sz w:val="20"/>
+          <w:szCs w:val="20"/>
+          <w:rtl/>
+        </w:rPr>
+        <w:t xml:space="preserve">نفر مبلغ </w:t>
+      </w:r>
       <w:r>
         <w:rPr>
           <w:rFonts w:ascii="B Nazanin" w:hAnsi="B Nazanin" w:cs="B Nazanin"/>
           <w:b/>
           <w:bCs/>
         </w:rPr>
-        <w:t>student_count</w:t>
-      </w:r>
-      <w:proofErr w:type="spellEnd"/>
-      <w:r>
-        <w:rPr>
-          <w:rFonts w:ascii="B Nazanin" w:hAnsi="B Nazanin" w:cs="B Nazanin"/>
-          <w:b/>
-          <w:bCs/>
-        </w:rPr>
-        <w:t xml:space="preserve">} </w:t>
-      </w:r>
-      <w:r>
-        <w:rPr>
-          <w:rFonts w:cs="B Nazanin"/>
-          <w:sz w:val="20"/>
-          <w:szCs w:val="20"/>
-          <w:rtl/>
-        </w:rPr>
-        <w:t xml:space="preserve">نفر مبلغ </w:t>
-      </w:r>
-      <w:r>
-        <w:rPr>
-          <w:rFonts w:ascii="B Nazanin" w:hAnsi="B Nazanin" w:cs="B Nazanin"/>
-          <w:b/>
-          <w:bCs/>
-        </w:rPr>
-        <w:t>{</w:t>
-      </w:r>
-      <w:proofErr w:type="spellStart"/>
-      <w:r>
-        <w:rPr>
-          <w:rFonts w:ascii="B Nazanin" w:hAnsi="B Nazanin" w:cs="B Nazanin"/>
-          <w:b/>
-          <w:bCs/>
-        </w:rPr>
-        <w:t>total_cert_fee</w:t>
-      </w:r>
-      <w:proofErr w:type="spellEnd"/>
-      <w:r>
-        <w:rPr>
-          <w:rFonts w:ascii="B Nazanin" w:hAnsi="B Nazanin" w:cs="B Nazanin"/>
-          <w:b/>
-          <w:bCs/>
-        </w:rPr>
-        <w:t>}</w:t>
+        <w:t>{total_cert_fee}</w:t>
       </w:r>
       <w:r>
         <w:rPr>
@@ -2440,7 +1915,29 @@
           <w:szCs w:val="20"/>
           <w:rtl/>
         </w:rPr>
-        <w:t xml:space="preserve"> طرف اول  </w:t>
+        <w:t xml:space="preserve"> طرف اول</w:t>
+      </w:r>
+      <w:r>
+        <w:rPr>
+          <w:rFonts w:cs="B Nazanin" w:hint="cs"/>
+          <w:b/>
+          <w:bCs/>
+          <w:sz w:val="20"/>
+          <w:szCs w:val="20"/>
+          <w:rtl/>
+        </w:rPr>
+        <w:t xml:space="preserve"> / کارآموز</w:t>
+      </w:r>
+      <w:r>
+        <w:rPr>
+          <w:rFonts w:cs="B Nazanin" w:hint="cs"/>
+          <w:b/>
+          <w:bCs/>
+          <w:sz w:val="20"/>
+          <w:szCs w:val="20"/>
+          <w:rtl/>
+        </w:rPr>
+        <w:t xml:space="preserve">  </w:t>
       </w:r>
       <w:r>
         <w:rPr>
@@ -2526,15 +2023,29 @@
           <w:szCs w:val="20"/>
           <w:rtl/>
         </w:rPr>
-        <w:t xml:space="preserve">طرف اول </w:t>
-      </w:r>
-      <w:r>
-        <w:rPr>
-          <w:rFonts w:cs="B Nazanin"/>
-          <w:sz w:val="20"/>
-          <w:szCs w:val="20"/>
+        <w:t>طرف اول</w:t>
+      </w:r>
+      <w:r>
+        <w:rPr>
+          <w:rFonts w:cs="B Nazanin" w:hint="cs"/>
+          <w:b/>
+          <w:bCs/>
+          <w:sz w:val="20"/>
+          <w:szCs w:val="20"/>
+          <w:rtl/>
         </w:rPr>
         <w:t xml:space="preserve"> </w:t>
+      </w:r>
+      <w:r>
+        <w:rPr>
+          <w:rFonts w:cs="B Nazanin" w:hint="cs"/>
+          <w:b/>
+          <w:bCs/>
+          <w:sz w:val="20"/>
+          <w:szCs w:val="20"/>
+          <w:rtl/>
+        </w:rPr>
+        <w:t xml:space="preserve">/ کارآموز </w:t>
       </w:r>
       <w:r>
         <w:rPr>
@@ -2803,103 +2314,49 @@
           <w:b/>
           <w:bCs/>
         </w:rPr>
-        <w:t>{</w:t>
-      </w:r>
-      <w:proofErr w:type="spellStart"/>
+        <w:t xml:space="preserve">{start_date} </w:t>
+      </w:r>
+      <w:r>
+        <w:rPr>
+          <w:rFonts w:cs="B Nazanin"/>
+          <w:sz w:val="20"/>
+          <w:szCs w:val="20"/>
+          <w:rtl/>
+        </w:rPr>
+        <w:t xml:space="preserve">تا تاریخ </w:t>
+      </w:r>
       <w:r>
         <w:rPr>
           <w:rFonts w:ascii="B Nazanin" w:hAnsi="B Nazanin" w:cs="B Nazanin"/>
           <w:b/>
           <w:bCs/>
         </w:rPr>
-        <w:t>start_date</w:t>
-      </w:r>
-      <w:proofErr w:type="spellEnd"/>
+        <w:t>{end_date}</w:t>
+      </w:r>
+      <w:r>
+        <w:rPr>
+          <w:rFonts w:cs="B Nazanin"/>
+          <w:sz w:val="20"/>
+          <w:szCs w:val="20"/>
+        </w:rPr>
+        <w:t xml:space="preserve"> </w:t>
+      </w:r>
+      <w:r>
+        <w:rPr>
+          <w:rFonts w:cs="B Nazanin"/>
+          <w:sz w:val="20"/>
+          <w:szCs w:val="20"/>
+          <w:rtl/>
+        </w:rPr>
+        <w:t xml:space="preserve">به مدت </w:t>
+      </w:r>
       <w:r>
         <w:rPr>
           <w:rFonts w:ascii="B Nazanin" w:hAnsi="B Nazanin" w:cs="B Nazanin"/>
           <w:b/>
           <w:bCs/>
         </w:rPr>
-        <w:t xml:space="preserve">} </w:t>
-      </w:r>
-      <w:r>
-        <w:rPr>
-          <w:rFonts w:cs="B Nazanin"/>
-          <w:sz w:val="20"/>
-          <w:szCs w:val="20"/>
-          <w:rtl/>
-        </w:rPr>
-        <w:t xml:space="preserve">تا تاریخ </w:t>
-      </w:r>
-      <w:r>
-        <w:rPr>
-          <w:rFonts w:ascii="B Nazanin" w:hAnsi="B Nazanin" w:cs="B Nazanin"/>
-          <w:b/>
-          <w:bCs/>
-        </w:rPr>
-        <w:t>{</w:t>
-      </w:r>
-      <w:proofErr w:type="spellStart"/>
-      <w:r>
-        <w:rPr>
-          <w:rFonts w:ascii="B Nazanin" w:hAnsi="B Nazanin" w:cs="B Nazanin"/>
-          <w:b/>
-          <w:bCs/>
-        </w:rPr>
-        <w:t>end_date</w:t>
-      </w:r>
-      <w:proofErr w:type="spellEnd"/>
-      <w:r>
-        <w:rPr>
-          <w:rFonts w:ascii="B Nazanin" w:hAnsi="B Nazanin" w:cs="B Nazanin"/>
-          <w:b/>
-          <w:bCs/>
-        </w:rPr>
-        <w:t>}</w:t>
-      </w:r>
-      <w:r>
-        <w:rPr>
-          <w:rFonts w:cs="B Nazanin"/>
-          <w:sz w:val="20"/>
-          <w:szCs w:val="20"/>
-        </w:rPr>
-        <w:t xml:space="preserve"> </w:t>
-      </w:r>
-      <w:r>
-        <w:rPr>
-          <w:rFonts w:cs="B Nazanin"/>
-          <w:sz w:val="20"/>
-          <w:szCs w:val="20"/>
-          <w:rtl/>
-        </w:rPr>
-        <w:t xml:space="preserve">به مدت </w:t>
-      </w:r>
-      <w:r>
-        <w:rPr>
-          <w:rFonts w:ascii="B Nazanin" w:hAnsi="B Nazanin" w:cs="B Nazanin"/>
-          <w:b/>
-          <w:bCs/>
-        </w:rPr>
-        <w:t>{</w:t>
-      </w:r>
-      <w:proofErr w:type="spellStart"/>
-      <w:r>
-        <w:rPr>
-          <w:rFonts w:ascii="B Nazanin" w:hAnsi="B Nazanin" w:cs="B Nazanin"/>
-          <w:b/>
-          <w:bCs/>
-        </w:rPr>
-        <w:t>total_days</w:t>
-      </w:r>
-      <w:proofErr w:type="spellEnd"/>
-      <w:r>
-        <w:rPr>
-          <w:rFonts w:ascii="B Nazanin" w:hAnsi="B Nazanin" w:cs="B Nazanin"/>
-          <w:b/>
-          <w:bCs/>
-        </w:rPr>
-        <w:t>}</w:t>
+        <w:t>{total_days}</w:t>
       </w:r>
       <w:r>
         <w:rPr>
@@ -3369,10 +2826,24 @@
                 <w:sz w:val="16"/>
                 <w:szCs w:val="16"/>
               </w:rPr>
-              <w:t>{</w:t>
-            </w:r>
-            <w:proofErr w:type="spellStart"/>
-            <w:r>
+              <w:t>{course_name}</w:t>
+            </w:r>
+          </w:p>
+        </w:tc>
+        <w:tc>
+          <w:tcPr>
+            <w:tcW w:w="1014" w:type="dxa"/>
+            <w:tcBorders>
+              <w:top w:val="single" w:sz="4" w:space="0" w:color="auto"/>
+              <w:left w:val="single" w:sz="4" w:space="0" w:color="auto"/>
+              <w:bottom w:val="single" w:sz="4" w:space="0" w:color="auto"/>
+              <w:right w:val="single" w:sz="4" w:space="0" w:color="auto"/>
+            </w:tcBorders>
+            <w:vAlign w:val="center"/>
+          </w:tcPr>
+          <w:p>
+            <w:pPr>
+              <w:jc w:val="center"/>
               <w:rPr>
                 <w:rFonts w:ascii="B Nazanin" w:hAnsi="B Nazanin" w:cs="B Nazanin"/>
                 <w:b/>
@@ -3380,9 +2851,7 @@
                 <w:sz w:val="16"/>
                 <w:szCs w:val="16"/>
               </w:rPr>
-              <w:t>course_name</w:t>
-            </w:r>
-            <w:proofErr w:type="spellEnd"/>
+            </w:pPr>
             <w:r>
               <w:rPr>
                 <w:rFonts w:ascii="B Nazanin" w:hAnsi="B Nazanin" w:cs="B Nazanin"/>
@@ -3391,13 +2860,13 @@
                 <w:sz w:val="16"/>
                 <w:szCs w:val="16"/>
               </w:rPr>
-              <w:t>}</w:t>
-            </w:r>
-          </w:p>
-        </w:tc>
-        <w:tc>
-          <w:tcPr>
-            <w:tcW w:w="1014" w:type="dxa"/>
+              <w:t>{teacher_name}</w:t>
+            </w:r>
+          </w:p>
+        </w:tc>
+        <w:tc>
+          <w:tcPr>
+            <w:tcW w:w="1134" w:type="dxa"/>
             <w:tcBorders>
               <w:top w:val="single" w:sz="4" w:space="0" w:color="auto"/>
               <w:left w:val="single" w:sz="4" w:space="0" w:color="auto"/>
@@ -3425,10 +2894,24 @@
                 <w:sz w:val="16"/>
                 <w:szCs w:val="16"/>
               </w:rPr>
-              <w:t>{</w:t>
-            </w:r>
-            <w:proofErr w:type="spellStart"/>
-            <w:r>
+              <w:t>{week_days}</w:t>
+            </w:r>
+          </w:p>
+        </w:tc>
+        <w:tc>
+          <w:tcPr>
+            <w:tcW w:w="828" w:type="dxa"/>
+            <w:tcBorders>
+              <w:top w:val="single" w:sz="4" w:space="0" w:color="auto"/>
+              <w:left w:val="single" w:sz="4" w:space="0" w:color="auto"/>
+              <w:bottom w:val="single" w:sz="4" w:space="0" w:color="auto"/>
+              <w:right w:val="single" w:sz="4" w:space="0" w:color="auto"/>
+            </w:tcBorders>
+            <w:vAlign w:val="center"/>
+          </w:tcPr>
+          <w:p>
+            <w:pPr>
+              <w:jc w:val="center"/>
               <w:rPr>
                 <w:rFonts w:ascii="B Nazanin" w:hAnsi="B Nazanin" w:cs="B Nazanin"/>
                 <w:b/>
@@ -3436,9 +2919,7 @@
                 <w:sz w:val="16"/>
                 <w:szCs w:val="16"/>
               </w:rPr>
-              <w:t>teacher_name</w:t>
-            </w:r>
-            <w:proofErr w:type="spellEnd"/>
+            </w:pPr>
             <w:r>
               <w:rPr>
                 <w:rFonts w:ascii="B Nazanin" w:hAnsi="B Nazanin" w:cs="B Nazanin"/>
@@ -3447,13 +2928,13 @@
                 <w:sz w:val="16"/>
                 <w:szCs w:val="16"/>
               </w:rPr>
-              <w:t>}</w:t>
-            </w:r>
-          </w:p>
-        </w:tc>
-        <w:tc>
-          <w:tcPr>
-            <w:tcW w:w="1134" w:type="dxa"/>
+              <w:t>{daily_hours}</w:t>
+            </w:r>
+          </w:p>
+        </w:tc>
+        <w:tc>
+          <w:tcPr>
+            <w:tcW w:w="567" w:type="dxa"/>
             <w:tcBorders>
               <w:top w:val="single" w:sz="4" w:space="0" w:color="auto"/>
               <w:left w:val="single" w:sz="4" w:space="0" w:color="auto"/>
@@ -3481,10 +2962,24 @@
                 <w:sz w:val="16"/>
                 <w:szCs w:val="16"/>
               </w:rPr>
-              <w:t>{</w:t>
-            </w:r>
-            <w:proofErr w:type="spellStart"/>
-            <w:r>
+              <w:t>{standard_hours}</w:t>
+            </w:r>
+          </w:p>
+        </w:tc>
+        <w:tc>
+          <w:tcPr>
+            <w:tcW w:w="993" w:type="dxa"/>
+            <w:tcBorders>
+              <w:top w:val="single" w:sz="4" w:space="0" w:color="auto"/>
+              <w:left w:val="single" w:sz="4" w:space="0" w:color="auto"/>
+              <w:bottom w:val="single" w:sz="4" w:space="0" w:color="auto"/>
+              <w:right w:val="single" w:sz="4" w:space="0" w:color="auto"/>
+            </w:tcBorders>
+            <w:vAlign w:val="center"/>
+          </w:tcPr>
+          <w:p>
+            <w:pPr>
+              <w:jc w:val="center"/>
               <w:rPr>
                 <w:rFonts w:ascii="B Nazanin" w:hAnsi="B Nazanin" w:cs="B Nazanin"/>
                 <w:b/>
@@ -3492,9 +2987,7 @@
                 <w:sz w:val="16"/>
                 <w:szCs w:val="16"/>
               </w:rPr>
-              <w:t>week_days</w:t>
-            </w:r>
-            <w:proofErr w:type="spellEnd"/>
+            </w:pPr>
             <w:r>
               <w:rPr>
                 <w:rFonts w:ascii="B Nazanin" w:hAnsi="B Nazanin" w:cs="B Nazanin"/>
@@ -3503,13 +2996,13 @@
                 <w:sz w:val="16"/>
                 <w:szCs w:val="16"/>
               </w:rPr>
-              <w:t>}</w:t>
-            </w:r>
-          </w:p>
-        </w:tc>
-        <w:tc>
-          <w:tcPr>
-            <w:tcW w:w="828" w:type="dxa"/>
+              <w:t>{student_count}</w:t>
+            </w:r>
+          </w:p>
+        </w:tc>
+        <w:tc>
+          <w:tcPr>
+            <w:tcW w:w="850" w:type="dxa"/>
             <w:tcBorders>
               <w:top w:val="single" w:sz="4" w:space="0" w:color="auto"/>
               <w:left w:val="single" w:sz="4" w:space="0" w:color="auto"/>
@@ -3537,10 +3030,26 @@
                 <w:sz w:val="16"/>
                 <w:szCs w:val="16"/>
               </w:rPr>
-              <w:t>{</w:t>
-            </w:r>
-            <w:proofErr w:type="spellStart"/>
-            <w:r>
+              <w:t>{total_days}</w:t>
+            </w:r>
+          </w:p>
+        </w:tc>
+        <w:tc>
+          <w:tcPr>
+            <w:tcW w:w="1217" w:type="dxa"/>
+            <w:tcBorders>
+              <w:top w:val="single" w:sz="4" w:space="0" w:color="auto"/>
+              <w:left w:val="single" w:sz="4" w:space="0" w:color="auto"/>
+              <w:bottom w:val="single" w:sz="4" w:space="0" w:color="auto"/>
+              <w:right w:val="single" w:sz="4" w:space="0" w:color="auto"/>
+            </w:tcBorders>
+            <w:shd w:val="clear" w:color="auto" w:fill="FBE4D5" w:themeFill="accent2" w:themeFillTint="33"/>
+            <w:vAlign w:val="center"/>
+          </w:tcPr>
+          <w:p>
+            <w:pPr>
+              <w:bidi w:val="0"/>
+              <w:jc w:val="center"/>
               <w:rPr>
                 <w:rFonts w:ascii="B Nazanin" w:hAnsi="B Nazanin" w:cs="B Nazanin"/>
                 <w:b/>
@@ -3548,9 +3057,7 @@
                 <w:sz w:val="16"/>
                 <w:szCs w:val="16"/>
               </w:rPr>
-              <w:t>daily_hours</w:t>
-            </w:r>
-            <w:proofErr w:type="spellEnd"/>
+            </w:pPr>
             <w:r>
               <w:rPr>
                 <w:rFonts w:ascii="B Nazanin" w:hAnsi="B Nazanin" w:cs="B Nazanin"/>
@@ -3559,19 +3066,20 @@
                 <w:sz w:val="16"/>
                 <w:szCs w:val="16"/>
               </w:rPr>
-              <w:t>}</w:t>
-            </w:r>
-          </w:p>
-        </w:tc>
-        <w:tc>
-          <w:tcPr>
-            <w:tcW w:w="567" w:type="dxa"/>
-            <w:tcBorders>
-              <w:top w:val="single" w:sz="4" w:space="0" w:color="auto"/>
-              <w:left w:val="single" w:sz="4" w:space="0" w:color="auto"/>
-              <w:bottom w:val="single" w:sz="4" w:space="0" w:color="auto"/>
-              <w:right w:val="single" w:sz="4" w:space="0" w:color="auto"/>
-            </w:tcBorders>
+              <w:t>{table1_total}</w:t>
+            </w:r>
+          </w:p>
+        </w:tc>
+        <w:tc>
+          <w:tcPr>
+            <w:tcW w:w="1138" w:type="dxa"/>
+            <w:tcBorders>
+              <w:top w:val="single" w:sz="4" w:space="0" w:color="auto"/>
+              <w:left w:val="single" w:sz="4" w:space="0" w:color="auto"/>
+              <w:bottom w:val="single" w:sz="4" w:space="0" w:color="auto"/>
+              <w:right w:val="single" w:sz="4" w:space="0" w:color="auto"/>
+            </w:tcBorders>
+            <w:shd w:val="clear" w:color="auto" w:fill="FBE4D5" w:themeFill="accent2" w:themeFillTint="33"/>
             <w:vAlign w:val="center"/>
           </w:tcPr>
           <w:p>
@@ -3593,234 +3101,7 @@
                 <w:sz w:val="16"/>
                 <w:szCs w:val="16"/>
               </w:rPr>
-              <w:t>{</w:t>
-            </w:r>
-            <w:proofErr w:type="spellStart"/>
-            <w:r>
-              <w:rPr>
-                <w:rFonts w:ascii="B Nazanin" w:hAnsi="B Nazanin" w:cs="B Nazanin"/>
-                <w:b/>
-                <w:bCs/>
-                <w:sz w:val="16"/>
-                <w:szCs w:val="16"/>
-              </w:rPr>
-              <w:t>standard_hours</w:t>
-            </w:r>
-            <w:proofErr w:type="spellEnd"/>
-            <w:r>
-              <w:rPr>
-                <w:rFonts w:ascii="B Nazanin" w:hAnsi="B Nazanin" w:cs="B Nazanin"/>
-                <w:b/>
-                <w:bCs/>
-                <w:sz w:val="16"/>
-                <w:szCs w:val="16"/>
-              </w:rPr>
-              <w:t>}</w:t>
-            </w:r>
-          </w:p>
-        </w:tc>
-        <w:tc>
-          <w:tcPr>
-            <w:tcW w:w="993" w:type="dxa"/>
-            <w:tcBorders>
-              <w:top w:val="single" w:sz="4" w:space="0" w:color="auto"/>
-              <w:left w:val="single" w:sz="4" w:space="0" w:color="auto"/>
-              <w:bottom w:val="single" w:sz="4" w:space="0" w:color="auto"/>
-              <w:right w:val="single" w:sz="4" w:space="0" w:color="auto"/>
-            </w:tcBorders>
-            <w:vAlign w:val="center"/>
-          </w:tcPr>
-          <w:p>
-            <w:pPr>
-              <w:jc w:val="center"/>
-              <w:rPr>
-                <w:rFonts w:ascii="B Nazanin" w:hAnsi="B Nazanin" w:cs="B Nazanin"/>
-                <w:b/>
-                <w:bCs/>
-                <w:sz w:val="16"/>
-                <w:szCs w:val="16"/>
-              </w:rPr>
-            </w:pPr>
-            <w:r>
-              <w:rPr>
-                <w:rFonts w:ascii="B Nazanin" w:hAnsi="B Nazanin" w:cs="B Nazanin"/>
-                <w:b/>
-                <w:bCs/>
-                <w:sz w:val="16"/>
-                <w:szCs w:val="16"/>
-              </w:rPr>
-              <w:t>{</w:t>
-            </w:r>
-            <w:proofErr w:type="spellStart"/>
-            <w:r>
-              <w:rPr>
-                <w:rFonts w:ascii="B Nazanin" w:hAnsi="B Nazanin" w:cs="B Nazanin"/>
-                <w:b/>
-                <w:bCs/>
-                <w:sz w:val="16"/>
-                <w:szCs w:val="16"/>
-              </w:rPr>
-              <w:t>student_count</w:t>
-            </w:r>
-            <w:proofErr w:type="spellEnd"/>
-            <w:r>
-              <w:rPr>
-                <w:rFonts w:ascii="B Nazanin" w:hAnsi="B Nazanin" w:cs="B Nazanin"/>
-                <w:b/>
-                <w:bCs/>
-                <w:sz w:val="16"/>
-                <w:szCs w:val="16"/>
-              </w:rPr>
-              <w:t>}</w:t>
-            </w:r>
-          </w:p>
-        </w:tc>
-        <w:tc>
-          <w:tcPr>
-            <w:tcW w:w="850" w:type="dxa"/>
-            <w:tcBorders>
-              <w:top w:val="single" w:sz="4" w:space="0" w:color="auto"/>
-              <w:left w:val="single" w:sz="4" w:space="0" w:color="auto"/>
-              <w:bottom w:val="single" w:sz="4" w:space="0" w:color="auto"/>
-              <w:right w:val="single" w:sz="4" w:space="0" w:color="auto"/>
-            </w:tcBorders>
-            <w:vAlign w:val="center"/>
-          </w:tcPr>
-          <w:p>
-            <w:pPr>
-              <w:jc w:val="center"/>
-              <w:rPr>
-                <w:rFonts w:ascii="B Nazanin" w:hAnsi="B Nazanin" w:cs="B Nazanin"/>
-                <w:b/>
-                <w:bCs/>
-                <w:sz w:val="16"/>
-                <w:szCs w:val="16"/>
-              </w:rPr>
-            </w:pPr>
-            <w:r>
-              <w:rPr>
-                <w:rFonts w:ascii="B Nazanin" w:hAnsi="B Nazanin" w:cs="B Nazanin"/>
-                <w:b/>
-                <w:bCs/>
-                <w:sz w:val="16"/>
-                <w:szCs w:val="16"/>
-              </w:rPr>
-              <w:t>{</w:t>
-            </w:r>
-            <w:proofErr w:type="spellStart"/>
-            <w:r>
-              <w:rPr>
-                <w:rFonts w:ascii="B Nazanin" w:hAnsi="B Nazanin" w:cs="B Nazanin"/>
-                <w:b/>
-                <w:bCs/>
-                <w:sz w:val="16"/>
-                <w:szCs w:val="16"/>
-              </w:rPr>
-              <w:t>total_days</w:t>
-            </w:r>
-            <w:proofErr w:type="spellEnd"/>
-            <w:r>
-              <w:rPr>
-                <w:rFonts w:ascii="B Nazanin" w:hAnsi="B Nazanin" w:cs="B Nazanin"/>
-                <w:b/>
-                <w:bCs/>
-                <w:sz w:val="16"/>
-                <w:szCs w:val="16"/>
-              </w:rPr>
-              <w:t>}</w:t>
-            </w:r>
-          </w:p>
-        </w:tc>
-        <w:tc>
-          <w:tcPr>
-            <w:tcW w:w="1217" w:type="dxa"/>
-            <w:tcBorders>
-              <w:top w:val="single" w:sz="4" w:space="0" w:color="auto"/>
-              <w:left w:val="single" w:sz="4" w:space="0" w:color="auto"/>
-              <w:bottom w:val="single" w:sz="4" w:space="0" w:color="auto"/>
-              <w:right w:val="single" w:sz="4" w:space="0" w:color="auto"/>
-            </w:tcBorders>
-            <w:shd w:val="clear" w:color="auto" w:fill="FBE4D5" w:themeFill="accent2" w:themeFillTint="33"/>
-            <w:vAlign w:val="center"/>
-          </w:tcPr>
-          <w:p>
-            <w:pPr>
-              <w:bidi w:val="0"/>
-              <w:jc w:val="center"/>
-              <w:rPr>
-                <w:rFonts w:ascii="B Nazanin" w:hAnsi="B Nazanin" w:cs="B Nazanin"/>
-                <w:b/>
-                <w:bCs/>
-                <w:sz w:val="16"/>
-                <w:szCs w:val="16"/>
-              </w:rPr>
-            </w:pPr>
-            <w:r>
-              <w:rPr>
-                <w:rFonts w:ascii="B Nazanin" w:hAnsi="B Nazanin" w:cs="B Nazanin"/>
-                <w:b/>
-                <w:bCs/>
-                <w:sz w:val="16"/>
-                <w:szCs w:val="16"/>
-              </w:rPr>
-              <w:t>{table1_total}</w:t>
-            </w:r>
-          </w:p>
-        </w:tc>
-        <w:tc>
-          <w:tcPr>
-            <w:tcW w:w="1138" w:type="dxa"/>
-            <w:tcBorders>
-              <w:top w:val="single" w:sz="4" w:space="0" w:color="auto"/>
-              <w:left w:val="single" w:sz="4" w:space="0" w:color="auto"/>
-              <w:bottom w:val="single" w:sz="4" w:space="0" w:color="auto"/>
-              <w:right w:val="single" w:sz="4" w:space="0" w:color="auto"/>
-            </w:tcBorders>
-            <w:shd w:val="clear" w:color="auto" w:fill="FBE4D5" w:themeFill="accent2" w:themeFillTint="33"/>
-            <w:vAlign w:val="center"/>
-          </w:tcPr>
-          <w:p>
-            <w:pPr>
-              <w:jc w:val="center"/>
-              <w:rPr>
-                <w:rFonts w:ascii="B Nazanin" w:hAnsi="B Nazanin" w:cs="B Nazanin"/>
-                <w:b/>
-                <w:bCs/>
-                <w:sz w:val="16"/>
-                <w:szCs w:val="16"/>
-              </w:rPr>
-            </w:pPr>
-            <w:r>
-              <w:rPr>
-                <w:rFonts w:ascii="B Nazanin" w:hAnsi="B Nazanin" w:cs="B Nazanin"/>
-                <w:b/>
-                <w:bCs/>
-                <w:sz w:val="16"/>
-                <w:szCs w:val="16"/>
-              </w:rPr>
-              <w:t>{</w:t>
-            </w:r>
-            <w:proofErr w:type="spellStart"/>
-            <w:r>
-              <w:rPr>
-                <w:rFonts w:ascii="B Nazanin" w:hAnsi="B Nazanin" w:cs="B Nazanin"/>
-                <w:b/>
-                <w:bCs/>
-                <w:sz w:val="16"/>
-                <w:szCs w:val="16"/>
-              </w:rPr>
-              <w:t>total_course_amount</w:t>
-            </w:r>
-            <w:proofErr w:type="spellEnd"/>
-            <w:r>
-              <w:rPr>
-                <w:rFonts w:ascii="B Nazanin" w:hAnsi="B Nazanin" w:cs="B Nazanin"/>
-                <w:b/>
-                <w:bCs/>
-                <w:sz w:val="16"/>
-                <w:szCs w:val="16"/>
-              </w:rPr>
-              <w:t>}</w:t>
+              <w:t>{total_course_amount}</w:t>
             </w:r>
           </w:p>
         </w:tc>
@@ -3847,7 +3128,7 @@
             <w:pPr>
               <w:jc w:val="center"/>
               <w:rPr>
-                <w:rFonts w:cs="B Nazanin" w:hint="cs"/>
+                <w:rFonts w:cs="B Nazanin"/>
                 <w:bCs/>
                 <w:sz w:val="16"/>
                 <w:szCs w:val="16"/>
@@ -3931,29 +3212,7 @@
                 <w:sz w:val="18"/>
                 <w:szCs w:val="18"/>
               </w:rPr>
-              <w:t>{</w:t>
-            </w:r>
-            <w:proofErr w:type="spellStart"/>
-            <w:r>
-              <w:rPr>
-                <w:rFonts w:ascii="B Nazanin" w:hAnsi="B Nazanin" w:cs="B Nazanin"/>
-                <w:b/>
-                <w:bCs/>
-                <w:sz w:val="18"/>
-                <w:szCs w:val="18"/>
-              </w:rPr>
-              <w:t>total_course_amount</w:t>
-            </w:r>
-            <w:proofErr w:type="spellEnd"/>
-            <w:r>
-              <w:rPr>
-                <w:rFonts w:ascii="B Nazanin" w:hAnsi="B Nazanin" w:cs="B Nazanin"/>
-                <w:b/>
-                <w:bCs/>
-                <w:sz w:val="18"/>
-                <w:szCs w:val="18"/>
-              </w:rPr>
-              <w:t>}</w:t>
+              <w:t>{total_course_amount}</w:t>
             </w:r>
           </w:p>
         </w:tc>
@@ -4250,25 +3509,7 @@
                 <w:b/>
                 <w:bCs/>
               </w:rPr>
-              <w:t>{</w:t>
-            </w:r>
-            <w:proofErr w:type="spellStart"/>
-            <w:r>
-              <w:rPr>
-                <w:rFonts w:ascii="B Nazanin" w:eastAsiaTheme="minorHAnsi" w:hAnsi="B Nazanin" w:cs="B Nazanin"/>
-                <w:b/>
-                <w:bCs/>
-              </w:rPr>
-              <w:t>cluster_header</w:t>
-            </w:r>
-            <w:proofErr w:type="spellEnd"/>
-            <w:r>
-              <w:rPr>
-                <w:rFonts w:ascii="B Nazanin" w:eastAsiaTheme="minorHAnsi" w:hAnsi="B Nazanin" w:cs="B Nazanin"/>
-                <w:b/>
-                <w:bCs/>
-              </w:rPr>
-              <w:t>}</w:t>
+              <w:t>{cluster_header}</w:t>
             </w:r>
           </w:p>
         </w:tc>
@@ -4511,25 +3752,7 @@
                 <w:b/>
                 <w:bCs/>
               </w:rPr>
-              <w:t>{</w:t>
-            </w:r>
-            <w:proofErr w:type="spellStart"/>
-            <w:r>
-              <w:rPr>
-                <w:rFonts w:ascii="B Nazanin" w:eastAsiaTheme="minorHAnsi" w:hAnsi="B Nazanin" w:cs="B Nazanin"/>
-                <w:b/>
-                <w:bCs/>
-              </w:rPr>
-              <w:t>base_tariff</w:t>
-            </w:r>
-            <w:proofErr w:type="spellEnd"/>
-            <w:r>
-              <w:rPr>
-                <w:rFonts w:ascii="B Nazanin" w:eastAsiaTheme="minorHAnsi" w:hAnsi="B Nazanin" w:cs="B Nazanin"/>
-                <w:b/>
-                <w:bCs/>
-              </w:rPr>
-              <w:t>}</w:t>
+              <w:t>{base_tariff}</w:t>
             </w:r>
           </w:p>
         </w:tc>
@@ -4762,25 +3985,7 @@
                 <w:b/>
                 <w:bCs/>
               </w:rPr>
-              <w:t>{</w:t>
-            </w:r>
-            <w:proofErr w:type="spellStart"/>
-            <w:r>
-              <w:rPr>
-                <w:rFonts w:ascii="B Nazanin" w:eastAsiaTheme="minorHAnsi" w:hAnsi="B Nazanin" w:cs="B Nazanin"/>
-                <w:b/>
-                <w:bCs/>
-              </w:rPr>
-              <w:t>base_tariff</w:t>
-            </w:r>
-            <w:proofErr w:type="spellEnd"/>
-            <w:r>
-              <w:rPr>
-                <w:rFonts w:ascii="B Nazanin" w:eastAsiaTheme="minorHAnsi" w:hAnsi="B Nazanin" w:cs="B Nazanin"/>
-                <w:b/>
-                <w:bCs/>
-              </w:rPr>
-              <w:t>}</w:t>
+              <w:t>{base_tariff}</w:t>
             </w:r>
           </w:p>
         </w:tc>
@@ -4799,7 +4004,7 @@
             <w:pPr>
               <w:jc w:val="center"/>
               <w:rPr>
-                <w:rFonts w:asciiTheme="minorHAnsi" w:eastAsiaTheme="minorHAnsi" w:hAnsiTheme="minorHAnsi" w:cs="B Nazanin" w:hint="cs"/>
+                <w:rFonts w:asciiTheme="minorHAnsi" w:eastAsiaTheme="minorHAnsi" w:hAnsiTheme="minorHAnsi" w:cs="B Nazanin"/>
                 <w:b/>
                 <w:bCs/>
                 <w:rtl/>
@@ -4940,7 +4145,7 @@
             <w:pPr>
               <w:jc w:val="center"/>
               <w:rPr>
-                <w:rFonts w:ascii="B Nazanin" w:eastAsiaTheme="minorHAnsi" w:hAnsi="B Nazanin" w:cs="B Nazanin" w:hint="cs"/>
+                <w:rFonts w:ascii="B Nazanin" w:eastAsiaTheme="minorHAnsi" w:hAnsi="B Nazanin" w:cs="B Nazanin"/>
                 <w:b/>
                 <w:bCs/>
                 <w:rtl/>
@@ -5002,37 +4207,19 @@
             <w:pPr>
               <w:jc w:val="center"/>
               <w:rPr>
-                <w:rFonts w:ascii="B Nazanin" w:eastAsiaTheme="minorHAnsi" w:hAnsi="B Nazanin" w:cs="B Nazanin" w:hint="cs"/>
-                <w:b/>
-                <w:bCs/>
-                <w:rtl/>
-              </w:rPr>
-            </w:pPr>
-            <w:r>
-              <w:rPr>
-                <w:rFonts w:ascii="B Nazanin" w:eastAsiaTheme="minorHAnsi" w:hAnsi="B Nazanin" w:cs="B Nazanin"/>
-                <w:b/>
-                <w:bCs/>
-              </w:rPr>
-              <w:t>{</w:t>
-            </w:r>
-            <w:proofErr w:type="spellStart"/>
-            <w:r>
-              <w:rPr>
-                <w:rFonts w:ascii="B Nazanin" w:eastAsiaTheme="minorHAnsi" w:hAnsi="B Nazanin" w:cs="B Nazanin"/>
-                <w:b/>
-                <w:bCs/>
-              </w:rPr>
-              <w:t>base_tariff</w:t>
-            </w:r>
-            <w:proofErr w:type="spellEnd"/>
-            <w:r>
-              <w:rPr>
-                <w:rFonts w:ascii="B Nazanin" w:eastAsiaTheme="minorHAnsi" w:hAnsi="B Nazanin" w:cs="B Nazanin"/>
-                <w:b/>
-                <w:bCs/>
-              </w:rPr>
-              <w:t>}</w:t>
+                <w:rFonts w:ascii="B Nazanin" w:eastAsiaTheme="minorHAnsi" w:hAnsi="B Nazanin" w:cs="B Nazanin"/>
+                <w:b/>
+                <w:bCs/>
+                <w:rtl/>
+              </w:rPr>
+            </w:pPr>
+            <w:r>
+              <w:rPr>
+                <w:rFonts w:ascii="B Nazanin" w:eastAsiaTheme="minorHAnsi" w:hAnsi="B Nazanin" w:cs="B Nazanin"/>
+                <w:b/>
+                <w:bCs/>
+              </w:rPr>
+              <w:t>{base_tariff}</w:t>
             </w:r>
           </w:p>
         </w:tc>
@@ -5051,7 +4238,7 @@
             <w:pPr>
               <w:jc w:val="center"/>
               <w:rPr>
-                <w:rFonts w:ascii="B Nazanin" w:eastAsiaTheme="minorHAnsi" w:hAnsi="B Nazanin" w:cs="B Nazanin" w:hint="cs"/>
+                <w:rFonts w:ascii="B Nazanin" w:eastAsiaTheme="minorHAnsi" w:hAnsi="B Nazanin" w:cs="B Nazanin"/>
                 <w:b/>
                 <w:bCs/>
                 <w:rtl/>
@@ -5265,25 +4452,7 @@
                 <w:b/>
                 <w:bCs/>
               </w:rPr>
-              <w:t>{</w:t>
-            </w:r>
-            <w:proofErr w:type="spellStart"/>
-            <w:r>
-              <w:rPr>
-                <w:rFonts w:ascii="B Nazanin" w:eastAsiaTheme="minorHAnsi" w:hAnsi="B Nazanin" w:cs="B Nazanin"/>
-                <w:b/>
-                <w:bCs/>
-              </w:rPr>
-              <w:t>base_tariff</w:t>
-            </w:r>
-            <w:proofErr w:type="spellEnd"/>
-            <w:r>
-              <w:rPr>
-                <w:rFonts w:ascii="B Nazanin" w:eastAsiaTheme="minorHAnsi" w:hAnsi="B Nazanin" w:cs="B Nazanin"/>
-                <w:b/>
-                <w:bCs/>
-              </w:rPr>
-              <w:t>}</w:t>
+              <w:t>{base_tariff}</w:t>
             </w:r>
           </w:p>
         </w:tc>
@@ -5515,25 +4684,7 @@
                 <w:b/>
                 <w:bCs/>
               </w:rPr>
-              <w:t>{</w:t>
-            </w:r>
-            <w:proofErr w:type="spellStart"/>
-            <w:r>
-              <w:rPr>
-                <w:rFonts w:ascii="B Nazanin" w:eastAsiaTheme="minorHAnsi" w:hAnsi="B Nazanin" w:cs="B Nazanin"/>
-                <w:b/>
-                <w:bCs/>
-              </w:rPr>
-              <w:t>base_tariff</w:t>
-            </w:r>
-            <w:proofErr w:type="spellEnd"/>
-            <w:r>
-              <w:rPr>
-                <w:rFonts w:ascii="B Nazanin" w:eastAsiaTheme="minorHAnsi" w:hAnsi="B Nazanin" w:cs="B Nazanin"/>
-                <w:b/>
-                <w:bCs/>
-              </w:rPr>
-              <w:t>}</w:t>
+              <w:t>{base_tariff}</w:t>
             </w:r>
           </w:p>
         </w:tc>
@@ -5766,25 +4917,7 @@
                 <w:b/>
                 <w:bCs/>
               </w:rPr>
-              <w:t>{</w:t>
-            </w:r>
-            <w:proofErr w:type="spellStart"/>
-            <w:r>
-              <w:rPr>
-                <w:rFonts w:ascii="B Nazanin" w:eastAsiaTheme="minorHAnsi" w:hAnsi="B Nazanin" w:cs="B Nazanin"/>
-                <w:b/>
-                <w:bCs/>
-              </w:rPr>
-              <w:t>base_tariff</w:t>
-            </w:r>
-            <w:proofErr w:type="spellEnd"/>
-            <w:r>
-              <w:rPr>
-                <w:rFonts w:ascii="B Nazanin" w:eastAsiaTheme="minorHAnsi" w:hAnsi="B Nazanin" w:cs="B Nazanin"/>
-                <w:b/>
-                <w:bCs/>
-              </w:rPr>
-              <w:t>}</w:t>
+              <w:t>{base_tariff}</w:t>
             </w:r>
           </w:p>
         </w:tc>
@@ -6017,25 +5150,7 @@
                 <w:b/>
                 <w:bCs/>
               </w:rPr>
-              <w:t>{</w:t>
-            </w:r>
-            <w:proofErr w:type="spellStart"/>
-            <w:r>
-              <w:rPr>
-                <w:rFonts w:ascii="B Nazanin" w:eastAsiaTheme="minorHAnsi" w:hAnsi="B Nazanin" w:cs="B Nazanin"/>
-                <w:b/>
-                <w:bCs/>
-              </w:rPr>
-              <w:t>base_tariff</w:t>
-            </w:r>
-            <w:proofErr w:type="spellEnd"/>
-            <w:r>
-              <w:rPr>
-                <w:rFonts w:ascii="B Nazanin" w:eastAsiaTheme="minorHAnsi" w:hAnsi="B Nazanin" w:cs="B Nazanin"/>
-                <w:b/>
-                <w:bCs/>
-              </w:rPr>
-              <w:t>}</w:t>
+              <w:t>{base_tariff}</w:t>
             </w:r>
           </w:p>
         </w:tc>
@@ -6268,25 +5383,7 @@
                 <w:b/>
                 <w:bCs/>
               </w:rPr>
-              <w:t>{</w:t>
-            </w:r>
-            <w:proofErr w:type="spellStart"/>
-            <w:r>
-              <w:rPr>
-                <w:rFonts w:ascii="B Nazanin" w:eastAsiaTheme="minorHAnsi" w:hAnsi="B Nazanin" w:cs="B Nazanin"/>
-                <w:b/>
-                <w:bCs/>
-              </w:rPr>
-              <w:t>base_tariff</w:t>
-            </w:r>
-            <w:proofErr w:type="spellEnd"/>
-            <w:r>
-              <w:rPr>
-                <w:rFonts w:ascii="B Nazanin" w:eastAsiaTheme="minorHAnsi" w:hAnsi="B Nazanin" w:cs="B Nazanin"/>
-                <w:b/>
-                <w:bCs/>
-              </w:rPr>
-              <w:t>}</w:t>
+              <w:t>{base_tariff}</w:t>
             </w:r>
           </w:p>
         </w:tc>
@@ -6518,25 +5615,7 @@
                 <w:b/>
                 <w:bCs/>
               </w:rPr>
-              <w:t>{</w:t>
-            </w:r>
-            <w:proofErr w:type="spellStart"/>
-            <w:r>
-              <w:rPr>
-                <w:rFonts w:ascii="B Nazanin" w:eastAsiaTheme="minorHAnsi" w:hAnsi="B Nazanin" w:cs="B Nazanin"/>
-                <w:b/>
-                <w:bCs/>
-              </w:rPr>
-              <w:t>base_tariff</w:t>
-            </w:r>
-            <w:proofErr w:type="spellEnd"/>
-            <w:r>
-              <w:rPr>
-                <w:rFonts w:ascii="B Nazanin" w:eastAsiaTheme="minorHAnsi" w:hAnsi="B Nazanin" w:cs="B Nazanin"/>
-                <w:b/>
-                <w:bCs/>
-              </w:rPr>
-              <w:t>}</w:t>
+              <w:t>{base_tariff}</w:t>
             </w:r>
           </w:p>
         </w:tc>
@@ -6768,25 +5847,7 @@
                 <w:b/>
                 <w:bCs/>
               </w:rPr>
-              <w:t>{</w:t>
-            </w:r>
-            <w:proofErr w:type="spellStart"/>
-            <w:r>
-              <w:rPr>
-                <w:rFonts w:ascii="B Nazanin" w:eastAsiaTheme="minorHAnsi" w:hAnsi="B Nazanin" w:cs="B Nazanin"/>
-                <w:b/>
-                <w:bCs/>
-              </w:rPr>
-              <w:t>base_tariff</w:t>
-            </w:r>
-            <w:proofErr w:type="spellEnd"/>
-            <w:r>
-              <w:rPr>
-                <w:rFonts w:ascii="B Nazanin" w:eastAsiaTheme="minorHAnsi" w:hAnsi="B Nazanin" w:cs="B Nazanin"/>
-                <w:b/>
-                <w:bCs/>
-              </w:rPr>
-              <w:t>}</w:t>
+              <w:t>{base_tariff}</w:t>
             </w:r>
           </w:p>
         </w:tc>
@@ -7018,25 +6079,7 @@
                 <w:b/>
                 <w:bCs/>
               </w:rPr>
-              <w:t>{</w:t>
-            </w:r>
-            <w:proofErr w:type="spellStart"/>
-            <w:r>
-              <w:rPr>
-                <w:rFonts w:ascii="B Nazanin" w:eastAsiaTheme="minorHAnsi" w:hAnsi="B Nazanin" w:cs="B Nazanin"/>
-                <w:b/>
-                <w:bCs/>
-              </w:rPr>
-              <w:t>base_tariff</w:t>
-            </w:r>
-            <w:proofErr w:type="spellEnd"/>
-            <w:r>
-              <w:rPr>
-                <w:rFonts w:ascii="B Nazanin" w:eastAsiaTheme="minorHAnsi" w:hAnsi="B Nazanin" w:cs="B Nazanin"/>
-                <w:b/>
-                <w:bCs/>
-              </w:rPr>
-              <w:t>}</w:t>
+              <w:t>{base_tariff}</w:t>
             </w:r>
           </w:p>
         </w:tc>
@@ -7268,25 +6311,7 @@
                 <w:b/>
                 <w:bCs/>
               </w:rPr>
-              <w:t>{</w:t>
-            </w:r>
-            <w:proofErr w:type="spellStart"/>
-            <w:r>
-              <w:rPr>
-                <w:rFonts w:ascii="B Nazanin" w:eastAsiaTheme="minorHAnsi" w:hAnsi="B Nazanin" w:cs="B Nazanin"/>
-                <w:b/>
-                <w:bCs/>
-              </w:rPr>
-              <w:t>base_tariff</w:t>
-            </w:r>
-            <w:proofErr w:type="spellEnd"/>
-            <w:r>
-              <w:rPr>
-                <w:rFonts w:ascii="B Nazanin" w:eastAsiaTheme="minorHAnsi" w:hAnsi="B Nazanin" w:cs="B Nazanin"/>
-                <w:b/>
-                <w:bCs/>
-              </w:rPr>
-              <w:t>}</w:t>
+              <w:t>{base_tariff}</w:t>
             </w:r>
           </w:p>
         </w:tc>
@@ -7342,7 +6367,7 @@
               <w:bidi w:val="0"/>
               <w:jc w:val="center"/>
               <w:rPr>
-                <w:rFonts w:ascii="Arial" w:eastAsia="Times New Roman" w:hAnsi="Arial" w:cs="2  Nazanin" w:hint="cs"/>
+                <w:rFonts w:ascii="Arial" w:eastAsia="Times New Roman" w:hAnsi="Arial" w:cs="2  Nazanin"/>
                 <w:b/>
                 <w:bCs/>
                 <w:sz w:val="18"/>
@@ -7449,8 +6474,6 @@
                 <w:szCs w:val="18"/>
               </w:rPr>
             </w:pPr>
-            <w:bookmarkStart w:id="0" w:name="_GoBack"/>
-            <w:bookmarkEnd w:id="0"/>
           </w:p>
         </w:tc>
       </w:tr>
@@ -7975,29 +6998,7 @@
                 <w:sz w:val="18"/>
                 <w:szCs w:val="18"/>
               </w:rPr>
-              <w:t>{</w:t>
-            </w:r>
-            <w:proofErr w:type="spellStart"/>
-            <w:r>
-              <w:rPr>
-                <w:rFonts w:ascii="B Nazanin" w:hAnsi="B Nazanin" w:cs="B Nazanin"/>
-                <w:b/>
-                <w:bCs/>
-                <w:sz w:val="18"/>
-                <w:szCs w:val="18"/>
-              </w:rPr>
-              <w:t>total_course_amount</w:t>
-            </w:r>
-            <w:proofErr w:type="spellEnd"/>
-            <w:r>
-              <w:rPr>
-                <w:rFonts w:ascii="B Nazanin" w:hAnsi="B Nazanin" w:cs="B Nazanin"/>
-                <w:b/>
-                <w:bCs/>
-                <w:sz w:val="18"/>
-                <w:szCs w:val="18"/>
-              </w:rPr>
-              <w:t>}</w:t>
+              <w:t>{total_course_amount}</w:t>
             </w:r>
           </w:p>
         </w:tc>
@@ -8554,29 +7555,7 @@
                 <w:sz w:val="18"/>
                 <w:szCs w:val="18"/>
               </w:rPr>
-              <w:t>{</w:t>
-            </w:r>
-            <w:proofErr w:type="spellStart"/>
-            <w:r>
-              <w:rPr>
-                <w:rFonts w:ascii="B Nazanin" w:hAnsi="B Nazanin" w:cs="B Nazanin"/>
-                <w:b/>
-                <w:bCs/>
-                <w:sz w:val="18"/>
-                <w:szCs w:val="18"/>
-              </w:rPr>
-              <w:t>total_exam_fee</w:t>
-            </w:r>
-            <w:proofErr w:type="spellEnd"/>
-            <w:r>
-              <w:rPr>
-                <w:rFonts w:ascii="B Nazanin" w:hAnsi="B Nazanin" w:cs="B Nazanin"/>
-                <w:b/>
-                <w:bCs/>
-                <w:sz w:val="18"/>
-                <w:szCs w:val="18"/>
-              </w:rPr>
-              <w:t>}</w:t>
+              <w:t>{total_exam_fee}</w:t>
             </w:r>
           </w:p>
         </w:tc>
@@ -8766,29 +7745,7 @@
                 <w:sz w:val="18"/>
                 <w:szCs w:val="18"/>
               </w:rPr>
-              <w:t>{</w:t>
-            </w:r>
-            <w:proofErr w:type="spellStart"/>
-            <w:r>
-              <w:rPr>
-                <w:rFonts w:ascii="B Nazanin" w:hAnsi="B Nazanin" w:cs="B Nazanin"/>
-                <w:b/>
-                <w:bCs/>
-                <w:sz w:val="18"/>
-                <w:szCs w:val="18"/>
-              </w:rPr>
-              <w:t>total_tiered_cost</w:t>
-            </w:r>
-            <w:proofErr w:type="spellEnd"/>
-            <w:r>
-              <w:rPr>
-                <w:rFonts w:ascii="B Nazanin" w:hAnsi="B Nazanin" w:cs="B Nazanin"/>
-                <w:b/>
-                <w:bCs/>
-                <w:sz w:val="18"/>
-                <w:szCs w:val="18"/>
-              </w:rPr>
-              <w:t>}</w:t>
+              <w:t>{total_tiered_cost}</w:t>
             </w:r>
           </w:p>
         </w:tc>
@@ -9363,118 +8320,64 @@
           <w:b/>
           <w:bCs/>
         </w:rPr>
-        <w:t>{</w:t>
-      </w:r>
-      <w:proofErr w:type="spellStart"/>
+        <w:t xml:space="preserve">{boss_name} </w:t>
+      </w:r>
+      <w:r>
+        <w:rPr>
+          <w:rFonts w:cs="B Nazanin" w:hint="cs"/>
+          <w:b/>
+          <w:bCs/>
+          <w:sz w:val="20"/>
+          <w:szCs w:val="20"/>
+          <w:rtl/>
+        </w:rPr>
+        <w:t xml:space="preserve"> </w:t>
+      </w:r>
+      <w:r>
+        <w:rPr>
+          <w:rFonts w:cs="B Nazanin" w:hint="cs"/>
+          <w:b/>
+          <w:sz w:val="20"/>
+          <w:szCs w:val="20"/>
+          <w:rtl/>
+        </w:rPr>
+        <w:t>(رئیس مرکز آموزش فنی و حرفه ای شهرستان</w:t>
+      </w:r>
+      <w:r>
+        <w:rPr>
+          <w:rFonts w:cs="B Nazanin" w:hint="cs"/>
+          <w:b/>
+          <w:sz w:val="20"/>
+          <w:szCs w:val="20"/>
+          <w:rtl/>
+        </w:rPr>
+        <w:t xml:space="preserve"> </w:t>
+      </w:r>
       <w:r>
         <w:rPr>
           <w:rFonts w:ascii="B Nazanin" w:hAnsi="B Nazanin" w:cs="B Nazanin"/>
           <w:b/>
           <w:bCs/>
         </w:rPr>
-        <w:t>boss_name</w:t>
-      </w:r>
-      <w:proofErr w:type="spellEnd"/>
+        <w:t>{center_name}</w:t>
+      </w:r>
+      <w:r>
+        <w:rPr>
+          <w:rFonts w:cs="B Nazanin" w:hint="cs"/>
+          <w:b/>
+          <w:sz w:val="20"/>
+          <w:szCs w:val="20"/>
+          <w:rtl/>
+        </w:rPr>
+        <w:t xml:space="preserve"> ) بعنوان نماينده تام الاختیار اداره کل آموزش فنی و حرفه ای استان گلستان  و مجری قرارداد که ذیل این تفاهمنامه با امضاء آن مسئولیت اجرا را بعهده میگیرد تعیین میگردد و آقا/ خانم  </w:t>
+      </w:r>
       <w:r>
         <w:rPr>
           <w:rFonts w:ascii="B Nazanin" w:hAnsi="B Nazanin" w:cs="B Nazanin"/>
           <w:b/>
           <w:bCs/>
         </w:rPr>
-        <w:t xml:space="preserve">} </w:t>
-      </w:r>
-      <w:r>
-        <w:rPr>
-          <w:rFonts w:cs="B Nazanin" w:hint="cs"/>
-          <w:b/>
-          <w:bCs/>
-          <w:sz w:val="20"/>
-          <w:szCs w:val="20"/>
-          <w:rtl/>
-        </w:rPr>
-        <w:t xml:space="preserve"> </w:t>
-      </w:r>
-      <w:r>
-        <w:rPr>
-          <w:rFonts w:cs="B Nazanin" w:hint="cs"/>
-          <w:b/>
-          <w:sz w:val="20"/>
-          <w:szCs w:val="20"/>
-          <w:rtl/>
-        </w:rPr>
-        <w:t>(رئیس مرکز آموزش فنی و حرفه ای شهرستان</w:t>
-      </w:r>
-      <w:r>
-        <w:rPr>
-          <w:rFonts w:cs="B Nazanin" w:hint="cs"/>
-          <w:b/>
-          <w:sz w:val="20"/>
-          <w:szCs w:val="20"/>
-          <w:rtl/>
-        </w:rPr>
-        <w:t xml:space="preserve"> </w:t>
-      </w:r>
-      <w:r>
-        <w:rPr>
-          <w:rFonts w:ascii="B Nazanin" w:hAnsi="B Nazanin" w:cs="B Nazanin"/>
-          <w:b/>
-          <w:bCs/>
-        </w:rPr>
-        <w:t>{</w:t>
-      </w:r>
-      <w:proofErr w:type="spellStart"/>
-      <w:r>
-        <w:rPr>
-          <w:rFonts w:ascii="B Nazanin" w:hAnsi="B Nazanin" w:cs="B Nazanin"/>
-          <w:b/>
-          <w:bCs/>
-        </w:rPr>
-        <w:t>center_name</w:t>
-      </w:r>
-      <w:proofErr w:type="spellEnd"/>
-      <w:r>
-        <w:rPr>
-          <w:rFonts w:ascii="B Nazanin" w:hAnsi="B Nazanin" w:cs="B Nazanin"/>
-          <w:b/>
-          <w:bCs/>
-        </w:rPr>
-        <w:t>}</w:t>
-      </w:r>
-      <w:r>
-        <w:rPr>
-          <w:rFonts w:cs="B Nazanin" w:hint="cs"/>
-          <w:b/>
-          <w:sz w:val="20"/>
-          <w:szCs w:val="20"/>
-          <w:rtl/>
-        </w:rPr>
-        <w:t xml:space="preserve"> ) بعنوان نماينده تام الاختیار اداره کل آموزش فنی و حرفه ای استان گلستان  و مجری قرارداد که ذیل این تفاهمنامه با امضاء آن مسئولیت اجرا را بعهده میگیرد تعیین میگردد و آقا/ خانم  </w:t>
-      </w:r>
-      <w:r>
-        <w:rPr>
-          <w:rFonts w:ascii="B Nazanin" w:hAnsi="B Nazanin" w:cs="B Nazanin"/>
-          <w:b/>
-          <w:bCs/>
-        </w:rPr>
-        <w:t>{</w:t>
-      </w:r>
-      <w:proofErr w:type="spellStart"/>
-      <w:r>
-        <w:rPr>
-          <w:rFonts w:ascii="B Nazanin" w:hAnsi="B Nazanin" w:cs="B Nazanin"/>
-          <w:b/>
-          <w:bCs/>
-        </w:rPr>
-        <w:t>mojri_rep</w:t>
-      </w:r>
-      <w:proofErr w:type="spellEnd"/>
-      <w:r>
-        <w:rPr>
-          <w:rFonts w:ascii="B Nazanin" w:hAnsi="B Nazanin" w:cs="B Nazanin"/>
-          <w:b/>
-          <w:bCs/>
-        </w:rPr>
-        <w:t>}</w:t>
+        <w:t>{mojri_rep}</w:t>
       </w:r>
       <w:r>
         <w:rPr>
@@ -9771,29 +8674,7 @@
                                 <w:sz w:val="24"/>
                                 <w:szCs w:val="24"/>
                               </w:rPr>
-                              <w:t>{</w:t>
-                            </w:r>
-                            <w:proofErr w:type="spellStart"/>
-                            <w:r>
-                              <w:rPr>
-                                <w:rFonts w:ascii="B Nazanin" w:hAnsi="B Nazanin" w:cs="B Nazanin"/>
-                                <w:b/>
-                                <w:bCs/>
-                                <w:sz w:val="24"/>
-                                <w:szCs w:val="24"/>
-                              </w:rPr>
-                              <w:t>mojri_rep</w:t>
-                            </w:r>
-                            <w:proofErr w:type="spellEnd"/>
-                            <w:r>
-                              <w:rPr>
-                                <w:rFonts w:ascii="B Nazanin" w:hAnsi="B Nazanin" w:cs="B Nazanin"/>
-                                <w:b/>
-                                <w:bCs/>
-                                <w:sz w:val="24"/>
-                                <w:szCs w:val="24"/>
-                              </w:rPr>
-                              <w:t xml:space="preserve">} </w:t>
+                              <w:t xml:space="preserve">{mojri_rep} </w:t>
                             </w:r>
                           </w:p>
                           <w:p>
@@ -9816,40 +8697,7 @@
                                 <w:sz w:val="24"/>
                                 <w:szCs w:val="24"/>
                               </w:rPr>
-                              <w:t>{</w:t>
-                            </w:r>
-                            <w:proofErr w:type="spellStart"/>
-                            <w:r>
-                              <w:rPr>
-                                <w:rFonts w:ascii="B Nazanin" w:hAnsi="B Nazanin" w:cs="B Nazanin"/>
-                                <w:b/>
-                                <w:bCs/>
-                                <w:sz w:val="24"/>
-                                <w:szCs w:val="24"/>
-                              </w:rPr>
-                              <w:t>mojri_</w:t>
-                            </w:r>
-                            <w:proofErr w:type="gramStart"/>
-                            <w:r>
-                              <w:rPr>
-                                <w:rFonts w:ascii="B Nazanin" w:hAnsi="B Nazanin" w:cs="B Nazanin"/>
-                                <w:b/>
-                                <w:bCs/>
-                                <w:sz w:val="24"/>
-                                <w:szCs w:val="24"/>
-                              </w:rPr>
-                              <w:t>title</w:t>
-                            </w:r>
-                            <w:proofErr w:type="spellEnd"/>
-                            <w:r>
-                              <w:rPr>
-                                <w:rFonts w:ascii="B Nazanin" w:hAnsi="B Nazanin" w:cs="B Nazanin"/>
-                                <w:b/>
-                                <w:bCs/>
-                                <w:sz w:val="24"/>
-                                <w:szCs w:val="24"/>
-                              </w:rPr>
-                              <w:t>}</w:t>
+                              <w:t>{mojri_title}</w:t>
                             </w:r>
                             <w:r>
                               <w:rPr>
@@ -9870,30 +8718,7 @@
                                 <w:sz w:val="24"/>
                                 <w:szCs w:val="24"/>
                               </w:rPr>
-                              <w:t>{</w:t>
-                            </w:r>
-                            <w:proofErr w:type="spellStart"/>
-                            <w:proofErr w:type="gramEnd"/>
-                            <w:r>
-                              <w:rPr>
-                                <w:rFonts w:ascii="B Nazanin" w:hAnsi="B Nazanin" w:cs="B Nazanin"/>
-                                <w:b/>
-                                <w:bCs/>
-                                <w:sz w:val="24"/>
-                                <w:szCs w:val="24"/>
-                              </w:rPr>
-                              <w:t>mojri_name</w:t>
-                            </w:r>
-                            <w:proofErr w:type="spellEnd"/>
-                            <w:r>
-                              <w:rPr>
-                                <w:rFonts w:ascii="B Nazanin" w:hAnsi="B Nazanin" w:cs="B Nazanin"/>
-                                <w:b/>
-                                <w:bCs/>
-                                <w:sz w:val="24"/>
-                                <w:szCs w:val="24"/>
-                              </w:rPr>
-                              <w:t>}</w:t>
+                              <w:t>{mojri_name}</w:t>
                             </w:r>
                           </w:p>
                         </w:txbxContent>
@@ -9964,29 +8789,7 @@
                           <w:sz w:val="24"/>
                           <w:szCs w:val="24"/>
                         </w:rPr>
-                        <w:t>{</w:t>
-                      </w:r>
-                      <w:proofErr w:type="spellStart"/>
-                      <w:r>
-                        <w:rPr>
-                          <w:rFonts w:ascii="B Nazanin" w:hAnsi="B Nazanin" w:cs="B Nazanin"/>
-                          <w:b/>
-                          <w:bCs/>
-                          <w:sz w:val="24"/>
-                          <w:szCs w:val="24"/>
-                        </w:rPr>
-                        <w:t>mojri_rep</w:t>
-                      </w:r>
-                      <w:proofErr w:type="spellEnd"/>
-                      <w:r>
-                        <w:rPr>
-                          <w:rFonts w:ascii="B Nazanin" w:hAnsi="B Nazanin" w:cs="B Nazanin"/>
-                          <w:b/>
-                          <w:bCs/>
-                          <w:sz w:val="24"/>
-                          <w:szCs w:val="24"/>
-                        </w:rPr>
-                        <w:t xml:space="preserve">} </w:t>
+                        <w:t xml:space="preserve">{mojri_rep} </w:t>
                       </w:r>
                     </w:p>
                     <w:p>
@@ -10009,40 +8812,7 @@
                           <w:sz w:val="24"/>
                           <w:szCs w:val="24"/>
                         </w:rPr>
-                        <w:t>{</w:t>
-                      </w:r>
-                      <w:proofErr w:type="spellStart"/>
-                      <w:r>
-                        <w:rPr>
-                          <w:rFonts w:ascii="B Nazanin" w:hAnsi="B Nazanin" w:cs="B Nazanin"/>
-                          <w:b/>
-                          <w:bCs/>
-                          <w:sz w:val="24"/>
-                          <w:szCs w:val="24"/>
-                        </w:rPr>
-                        <w:t>mojri_</w:t>
-                      </w:r>
-                      <w:proofErr w:type="gramStart"/>
-                      <w:r>
-                        <w:rPr>
-                          <w:rFonts w:ascii="B Nazanin" w:hAnsi="B Nazanin" w:cs="B Nazanin"/>
-                          <w:b/>
-                          <w:bCs/>
-                          <w:sz w:val="24"/>
-                          <w:szCs w:val="24"/>
-                        </w:rPr>
-                        <w:t>title</w:t>
-                      </w:r>
-                      <w:proofErr w:type="spellEnd"/>
-                      <w:r>
-                        <w:rPr>
-                          <w:rFonts w:ascii="B Nazanin" w:hAnsi="B Nazanin" w:cs="B Nazanin"/>
-                          <w:b/>
-                          <w:bCs/>
-                          <w:sz w:val="24"/>
-                          <w:szCs w:val="24"/>
-                        </w:rPr>
-                        <w:t>}</w:t>
+                        <w:t>{mojri_title}</w:t>
                       </w:r>
                       <w:r>
                         <w:rPr>
@@ -10063,30 +8833,7 @@
                           <w:sz w:val="24"/>
                           <w:szCs w:val="24"/>
                         </w:rPr>
-                        <w:t>{</w:t>
-                      </w:r>
-                      <w:proofErr w:type="spellStart"/>
-                      <w:proofErr w:type="gramEnd"/>
-                      <w:r>
-                        <w:rPr>
-                          <w:rFonts w:ascii="B Nazanin" w:hAnsi="B Nazanin" w:cs="B Nazanin"/>
-                          <w:b/>
-                          <w:bCs/>
-                          <w:sz w:val="24"/>
-                          <w:szCs w:val="24"/>
-                        </w:rPr>
-                        <w:t>mojri_name</w:t>
-                      </w:r>
-                      <w:proofErr w:type="spellEnd"/>
-                      <w:r>
-                        <w:rPr>
-                          <w:rFonts w:ascii="B Nazanin" w:hAnsi="B Nazanin" w:cs="B Nazanin"/>
-                          <w:b/>
-                          <w:bCs/>
-                          <w:sz w:val="24"/>
-                          <w:szCs w:val="24"/>
-                        </w:rPr>
-                        <w:t>}</w:t>
+                        <w:t>{mojri_name}</w:t>
                       </w:r>
                     </w:p>
                   </w:txbxContent>
@@ -10490,29 +9237,7 @@
                                 <w:sz w:val="24"/>
                                 <w:szCs w:val="24"/>
                               </w:rPr>
-                              <w:t>{</w:t>
-                            </w:r>
-                            <w:proofErr w:type="spellStart"/>
-                            <w:r>
-                              <w:rPr>
-                                <w:rFonts w:ascii="B Nazanin" w:hAnsi="B Nazanin" w:cs="B Nazanin"/>
-                                <w:b/>
-                                <w:bCs/>
-                                <w:sz w:val="24"/>
-                                <w:szCs w:val="24"/>
-                              </w:rPr>
-                              <w:t>boss_name</w:t>
-                            </w:r>
-                            <w:proofErr w:type="spellEnd"/>
-                            <w:r>
-                              <w:rPr>
-                                <w:rFonts w:ascii="B Nazanin" w:hAnsi="B Nazanin" w:cs="B Nazanin"/>
-                                <w:b/>
-                                <w:bCs/>
-                                <w:sz w:val="24"/>
-                                <w:szCs w:val="24"/>
-                              </w:rPr>
-                              <w:t xml:space="preserve">} </w:t>
+                              <w:t xml:space="preserve">{boss_name} </w:t>
                             </w:r>
                           </w:p>
                           <w:p>
@@ -10578,29 +9303,7 @@
                           <w:sz w:val="24"/>
                           <w:szCs w:val="24"/>
                         </w:rPr>
-                        <w:t>{</w:t>
-                      </w:r>
-                      <w:proofErr w:type="spellStart"/>
-                      <w:r>
-                        <w:rPr>
-                          <w:rFonts w:ascii="B Nazanin" w:hAnsi="B Nazanin" w:cs="B Nazanin"/>
-                          <w:b/>
-                          <w:bCs/>
-                          <w:sz w:val="24"/>
-                          <w:szCs w:val="24"/>
-                        </w:rPr>
-                        <w:t>boss_name</w:t>
-                      </w:r>
-                      <w:proofErr w:type="spellEnd"/>
-                      <w:r>
-                        <w:rPr>
-                          <w:rFonts w:ascii="B Nazanin" w:hAnsi="B Nazanin" w:cs="B Nazanin"/>
-                          <w:b/>
-                          <w:bCs/>
-                          <w:sz w:val="24"/>
-                          <w:szCs w:val="24"/>
-                        </w:rPr>
-                        <w:t xml:space="preserve">} </w:t>
+                        <w:t xml:space="preserve">{boss_name} </w:t>
                       </w:r>
                     </w:p>
                     <w:p>
@@ -11532,7 +10235,6 @@
   <w:style w:type="character" w:default="1" w:styleId="DefaultParagraphFont">
     <w:name w:val="Default Paragraph Font"/>
     <w:uiPriority w:val="1"/>
-    <w:semiHidden/>
     <w:unhideWhenUsed/>
   </w:style>
   <w:style w:type="table" w:default="1" w:styleId="TableNormal">

</xml_diff>

<commit_message>
feat: validate numeric inputs in contract form
Ensure student and course counts only accept digits, handle Persian-to-English digit conversion, and enforce positive values.
</commit_message>
<xml_diff>
--- a/public/template.docx
+++ b/public/template.docx
@@ -12,6 +12,8 @@
           <w:rtl/>
         </w:rPr>
       </w:pPr>
+      <w:bookmarkStart w:id="0" w:name="_GoBack"/>
+      <w:bookmarkEnd w:id="0"/>
       <w:r>
         <w:rPr>
           <w:rFonts w:cs="2  Titr"/>
@@ -1691,8 +1693,6 @@
         </w:rPr>
         <w:t xml:space="preserve">سال ۱۴۰۵ به ازای هر نفر در </w:t>
       </w:r>
-      <w:bookmarkStart w:id="0" w:name="_GoBack"/>
-      <w:bookmarkEnd w:id="0"/>
       <w:r>
         <w:rPr>
           <w:rFonts w:ascii="B Nazanin" w:hAnsi="B Nazanin" w:cs="B Nazanin"/>

</xml_diff>